<commit_message>
Fix Vercel deployment: use /tmp directory for file operations
</commit_message>
<xml_diff>
--- a/PDF_CONVERTED.docx
+++ b/PDF_CONVERTED.docx
@@ -2,6 +2,66 @@
 <file path=word/document.xml><?xml version="1.0" encoding="utf-8"?>
 <w:document xmlns:wpc="http://schemas.microsoft.com/office/word/2010/wordprocessingCanvas" xmlns:mo="http://schemas.microsoft.com/office/mac/office/2008/main" xmlns:mc="http://schemas.openxmlformats.org/markup-compatibility/2006" xmlns:mv="urn:schemas-microsoft-com:mac:vml" xmlns:o="urn:schemas-microsoft-com:office:office" xmlns:r="http://schemas.openxmlformats.org/officeDocument/2006/relationships" xmlns:m="http://schemas.openxmlformats.org/officeDocument/2006/math" xmlns:v="urn:schemas-microsoft-com:vml" xmlns:wp14="http://schemas.microsoft.com/office/word/2010/wordprocessingDrawing" xmlns:wp="http://schemas.openxmlformats.org/drawingml/2006/wordprocessingDrawing" xmlns:w10="urn:schemas-microsoft-com:office:word" xmlns:w="http://schemas.openxmlformats.org/wordprocessingml/2006/main" xmlns:w14="http://schemas.microsoft.com/office/word/2010/wordml" xmlns:wpg="http://schemas.microsoft.com/office/word/2010/wordprocessingGroup" xmlns:wpi="http://schemas.microsoft.com/office/word/2010/wordprocessingInk" xmlns:wne="http://schemas.microsoft.com/office/word/2006/wordml" xmlns:wps="http://schemas.microsoft.com/office/word/2010/wordprocessingShape" mc:Ignorable="w14 wp14">
   <w:body>
+    <w:tbl>
+      <w:tblPr>
+        <w:tblW w:type="auto" w:w="0"/>
+        <w:tblLayout w:type="fixed"/>
+        <w:tblLook w:firstColumn="1" w:firstRow="1" w:lastColumn="0" w:lastRow="0" w:noHBand="0" w:noVBand="1" w:val="04A0"/>
+      </w:tblPr>
+      <w:tblGrid>
+        <w:gridCol w:w="2880"/>
+        <w:gridCol w:w="2880"/>
+        <w:gridCol w:w="2880"/>
+      </w:tblGrid>
+      <w:tr>
+        <w:tc>
+          <w:tcPr>
+            <w:tcW w:type="dxa" w:w="2880"/>
+            <w:tcBorders/>
+          </w:tcPr>
+          <w:p>
+            <w:pPr>
+              <w:jc w:val="left"/>
+            </w:pPr>
+            <w:r>
+              <w:rPr>
+                <w:i/>
+                <w:color w:val="969696"/>
+                <w:sz w:val="22"/>
+              </w:rPr>
+              <w:t>Learners' Survey</w:t>
+            </w:r>
+          </w:p>
+        </w:tc>
+        <w:tc>
+          <w:tcPr>
+            <w:tcW w:type="dxa" w:w="2880"/>
+            <w:tcBorders/>
+          </w:tcPr>
+          <w:p/>
+        </w:tc>
+        <w:tc>
+          <w:tcPr>
+            <w:tcW w:type="dxa" w:w="2880"/>
+            <w:tcBorders/>
+          </w:tcPr>
+          <w:p>
+            <w:pPr>
+              <w:jc w:val="right"/>
+            </w:pPr>
+            <w:r>
+              <w:rPr>
+                <w:i/>
+                <w:color w:val="969696"/>
+                <w:sz w:val="22"/>
+              </w:rPr>
+              <w:t>Academic Session 2026-2027</w:t>
+            </w:r>
+          </w:p>
+        </w:tc>
+      </w:tr>
+    </w:tbl>
+    <w:p/>
     <w:p>
       <w:pPr>
         <w:jc w:val="center"/>
@@ -9,26 +69,24 @@
       <w:r>
         <w:rPr>
           <w:b/>
+          <w:color w:val="1F3864"/>
+          <w:sz w:val="40"/>
         </w:rPr>
-        <w:t>Learner's Survey</w:t>
-        <w:br/>
-        <w:t>Academic Year 2025-2026</w:t>
+        <w:t>fdf</w:t>
         <w:br/>
       </w:r>
       <w:r>
         <w:rPr>
           <w:b/>
+          <w:color w:val="1F3864"/>
+          <w:sz w:val="40"/>
         </w:rPr>
-        <w:t>Campus name</w:t>
+        <w:t>fdf</w:t>
       </w:r>
     </w:p>
-    <w:p/>
     <w:p>
-      <w:pPr>
-        <w:pStyle w:val="Heading2"/>
-      </w:pPr>
       <w:r>
-        <w:t>Q#1 Select the top 4 best teachers.</w:t>
+        <w:t>____________________________________________________________________________________________________</w:t>
       </w:r>
     </w:p>
     <w:tbl>
@@ -46,37 +104,38 @@
       </w:tblPr>
       <w:tblGrid>
         <w:gridCol w:w="2880"/>
-        <w:gridCol w:w="2880"/>
-        <w:gridCol w:w="2880"/>
+        <w:gridCol w:w="6480"/>
       </w:tblGrid>
       <w:tr>
         <w:tc>
           <w:tcPr>
-            <w:tcW w:type="dxa" w:w="2880"/>
+            <w:tcW w:type="dxa" w:w="4320"/>
+            <w:shd w:fill="E7E6E6"/>
           </w:tcPr>
           <w:p>
+            <w:r/>
             <w:r>
-              <w:t>Teacher</w:t>
+              <w:rPr>
+                <w:b/>
+                <w:sz w:val="22"/>
+              </w:rPr>
+              <w:t>Grade-Section</w:t>
             </w:r>
           </w:p>
         </w:tc>
         <w:tc>
           <w:tcPr>
-            <w:tcW w:type="dxa" w:w="2880"/>
+            <w:tcW w:type="dxa" w:w="4320"/>
           </w:tcPr>
           <w:p>
+            <w:r/>
             <w:r>
-              <w:t>Responses</w:t>
-            </w:r>
-          </w:p>
-        </w:tc>
-        <w:tc>
-          <w:tcPr>
-            <w:tcW w:type="dxa" w:w="2880"/>
-          </w:tcPr>
-          <w:p>
-            <w:r>
-              <w:t>Percentage</w:t>
+              <w:rPr>
+                <w:b/>
+                <w:color w:val="1F3864"/>
+                <w:sz w:val="22"/>
+              </w:rPr>
+              <w:t>fdf</w:t>
             </w:r>
           </w:p>
         </w:tc>
@@ -84,31 +143,31 @@
       <w:tr>
         <w:tc>
           <w:tcPr>
-            <w:tcW w:type="dxa" w:w="2880"/>
+            <w:tcW w:type="dxa" w:w="4320"/>
+            <w:shd w:fill="E7E6E6"/>
           </w:tcPr>
           <w:p>
+            <w:r/>
             <w:r>
-              <w:t>Ms. Alishba Maryum - Computing</w:t>
+              <w:rPr>
+                <w:b/>
+                <w:sz w:val="22"/>
+              </w:rPr>
+              <w:t>Survey Date</w:t>
             </w:r>
           </w:p>
         </w:tc>
         <w:tc>
           <w:tcPr>
-            <w:tcW w:type="dxa" w:w="2880"/>
+            <w:tcW w:type="dxa" w:w="4320"/>
           </w:tcPr>
           <w:p>
+            <w:r/>
             <w:r>
-              <w:t>3</w:t>
-            </w:r>
-          </w:p>
-        </w:tc>
-        <w:tc>
-          <w:tcPr>
-            <w:tcW w:type="dxa" w:w="2880"/>
-          </w:tcPr>
-          <w:p>
-            <w:r>
-              <w:t>4.4%</w:t>
+              <w:rPr>
+                <w:sz w:val="22"/>
+              </w:rPr>
+              <w:t>September 21, 2026</w:t>
             </w:r>
           </w:p>
         </w:tc>
@@ -116,31 +175,31 @@
       <w:tr>
         <w:tc>
           <w:tcPr>
-            <w:tcW w:type="dxa" w:w="2880"/>
+            <w:tcW w:type="dxa" w:w="4320"/>
+            <w:shd w:fill="E7E6E6"/>
           </w:tcPr>
           <w:p>
+            <w:r/>
             <w:r>
-              <w:t>Ms. Ayesha Babar - English</w:t>
+              <w:rPr>
+                <w:b/>
+                <w:sz w:val="22"/>
+              </w:rPr>
+              <w:t>Total Students</w:t>
             </w:r>
           </w:p>
         </w:tc>
         <w:tc>
           <w:tcPr>
-            <w:tcW w:type="dxa" w:w="2880"/>
+            <w:tcW w:type="dxa" w:w="4320"/>
           </w:tcPr>
           <w:p>
+            <w:r/>
             <w:r>
-              <w:t>19</w:t>
-            </w:r>
-          </w:p>
-        </w:tc>
-        <w:tc>
-          <w:tcPr>
-            <w:tcW w:type="dxa" w:w="2880"/>
-          </w:tcPr>
-          <w:p>
-            <w:r>
-              <w:t>27.9%</w:t>
+              <w:rPr>
+                <w:sz w:val="22"/>
+              </w:rPr>
+              <w:t>26</w:t>
             </w:r>
           </w:p>
         </w:tc>
@@ -148,175 +207,50 @@
       <w:tr>
         <w:tc>
           <w:tcPr>
-            <w:tcW w:type="dxa" w:w="2880"/>
+            <w:tcW w:type="dxa" w:w="4320"/>
+            <w:shd w:fill="E7E6E6"/>
           </w:tcPr>
           <w:p>
+            <w:r/>
             <w:r>
-              <w:t>Ms. Kulsoom Khan - Science</w:t>
+              <w:rPr>
+                <w:b/>
+                <w:sz w:val="22"/>
+              </w:rPr>
+              <w:t>Total Responses</w:t>
             </w:r>
           </w:p>
         </w:tc>
         <w:tc>
           <w:tcPr>
-            <w:tcW w:type="dxa" w:w="2880"/>
+            <w:tcW w:type="dxa" w:w="4320"/>
           </w:tcPr>
           <w:p>
+            <w:r/>
             <w:r>
-              <w:t>17</w:t>
-            </w:r>
-          </w:p>
-        </w:tc>
-        <w:tc>
-          <w:tcPr>
-            <w:tcW w:type="dxa" w:w="2880"/>
-          </w:tcPr>
-          <w:p>
-            <w:r>
-              <w:t>25.0%</w:t>
-            </w:r>
-          </w:p>
-        </w:tc>
-      </w:tr>
-      <w:tr>
-        <w:tc>
-          <w:tcPr>
-            <w:tcW w:type="dxa" w:w="2880"/>
-          </w:tcPr>
-          <w:p>
-            <w:r>
-              <w:t>Ms. Maria Yaqoob - GP</w:t>
-            </w:r>
-          </w:p>
-        </w:tc>
-        <w:tc>
-          <w:tcPr>
-            <w:tcW w:type="dxa" w:w="2880"/>
-          </w:tcPr>
-          <w:p>
-            <w:r>
-              <w:t>3</w:t>
-            </w:r>
-          </w:p>
-        </w:tc>
-        <w:tc>
-          <w:tcPr>
-            <w:tcW w:type="dxa" w:w="2880"/>
-          </w:tcPr>
-          <w:p>
-            <w:r>
-              <w:t>4.4%</w:t>
-            </w:r>
-          </w:p>
-        </w:tc>
-      </w:tr>
-      <w:tr>
-        <w:tc>
-          <w:tcPr>
-            <w:tcW w:type="dxa" w:w="2880"/>
-          </w:tcPr>
-          <w:p>
-            <w:r>
-              <w:t>Ms. Raiha Batool - Maths</w:t>
-            </w:r>
-          </w:p>
-        </w:tc>
-        <w:tc>
-          <w:tcPr>
-            <w:tcW w:type="dxa" w:w="2880"/>
-          </w:tcPr>
-          <w:p>
-            <w:r>
-              <w:t>15</w:t>
-            </w:r>
-          </w:p>
-        </w:tc>
-        <w:tc>
-          <w:tcPr>
-            <w:tcW w:type="dxa" w:w="2880"/>
-          </w:tcPr>
-          <w:p>
-            <w:r>
-              <w:t>22.1%</w:t>
-            </w:r>
-          </w:p>
-        </w:tc>
-      </w:tr>
-      <w:tr>
-        <w:tc>
-          <w:tcPr>
-            <w:tcW w:type="dxa" w:w="2880"/>
-          </w:tcPr>
-          <w:p>
-            <w:r>
-              <w:t>Ms. Samira Naveed - Urdu</w:t>
-            </w:r>
-          </w:p>
-        </w:tc>
-        <w:tc>
-          <w:tcPr>
-            <w:tcW w:type="dxa" w:w="2880"/>
-          </w:tcPr>
-          <w:p>
-            <w:r>
-              <w:t>9</w:t>
-            </w:r>
-          </w:p>
-        </w:tc>
-        <w:tc>
-          <w:tcPr>
-            <w:tcW w:type="dxa" w:w="2880"/>
-          </w:tcPr>
-          <w:p>
-            <w:r>
-              <w:t>13.2%</w:t>
-            </w:r>
-          </w:p>
-        </w:tc>
-      </w:tr>
-      <w:tr>
-        <w:tc>
-          <w:tcPr>
-            <w:tcW w:type="dxa" w:w="2880"/>
-          </w:tcPr>
-          <w:p>
-            <w:r>
-              <w:t>Ms. Summia Naz - Islamiat</w:t>
-            </w:r>
-          </w:p>
-        </w:tc>
-        <w:tc>
-          <w:tcPr>
-            <w:tcW w:type="dxa" w:w="2880"/>
-          </w:tcPr>
-          <w:p>
-            <w:r>
-              <w:t>2</w:t>
-            </w:r>
-          </w:p>
-        </w:tc>
-        <w:tc>
-          <w:tcPr>
-            <w:tcW w:type="dxa" w:w="2880"/>
-          </w:tcPr>
-          <w:p>
-            <w:r>
-              <w:t>2.9%</w:t>
+              <w:rPr>
+                <w:sz w:val="22"/>
+              </w:rPr>
+              <w:t>26</w:t>
             </w:r>
           </w:p>
         </w:tc>
       </w:tr>
     </w:tbl>
+    <w:p/>
     <w:p>
       <w:r>
-        <w:br w:type="page"/>
+        <w:rPr>
+          <w:b/>
+          <w:color w:val="1F3864"/>
+          <w:sz w:val="22"/>
+        </w:rPr>
+        <w:t>Q1 Which teachers encourage you to ask questions in class and are happy to explain things again?</w:t>
       </w:r>
     </w:p>
     <w:p>
-      <w:pPr>
-        <w:pStyle w:val="Heading2"/>
-      </w:pPr>
       <w:r>
-        <w:t>Q#2 Select any 2 teachers who are difficult to understand?</w:t>
+        <w:t>____________________________________________________________________________________________________</w:t>
       </w:r>
     </w:p>
     <w:tbl>
@@ -333,18 +267,105 @@
         </w:tblBorders>
       </w:tblPr>
       <w:tblGrid>
+        <w:gridCol w:w="3600"/>
         <w:gridCol w:w="2880"/>
-        <w:gridCol w:w="2880"/>
-        <w:gridCol w:w="2880"/>
+        <w:gridCol w:w="1728"/>
+        <w:gridCol w:w="1152"/>
       </w:tblGrid>
       <w:tr>
         <w:tc>
           <w:tcPr>
-            <w:tcW w:type="dxa" w:w="2880"/>
+            <w:tcW w:type="dxa" w:w="2160"/>
+            <w:shd w:fill="1F3864"/>
           </w:tcPr>
           <w:p>
+            <w:pPr>
+              <w:jc w:val="center"/>
+            </w:pPr>
+            <w:r/>
             <w:r>
+              <w:rPr>
+                <w:b/>
+                <w:color w:val="FFFFFF"/>
+                <w:sz w:val="22"/>
+              </w:rPr>
               <w:t>Teacher</w:t>
+            </w:r>
+          </w:p>
+        </w:tc>
+        <w:tc>
+          <w:tcPr>
+            <w:tcW w:type="dxa" w:w="2160"/>
+            <w:shd w:fill="1F3864"/>
+          </w:tcPr>
+          <w:p>
+            <w:pPr>
+              <w:jc w:val="center"/>
+            </w:pPr>
+            <w:r/>
+            <w:r>
+              <w:rPr>
+                <w:b/>
+                <w:color w:val="FFFFFF"/>
+                <w:sz w:val="22"/>
+              </w:rPr>
+              <w:t>Subject</w:t>
+            </w:r>
+          </w:p>
+        </w:tc>
+        <w:tc>
+          <w:tcPr>
+            <w:tcW w:type="dxa" w:w="2160"/>
+            <w:shd w:fill="1F3864"/>
+          </w:tcPr>
+          <w:p>
+            <w:pPr>
+              <w:jc w:val="center"/>
+            </w:pPr>
+            <w:r/>
+            <w:r>
+              <w:rPr>
+                <w:b/>
+                <w:color w:val="FFFFFF"/>
+                <w:sz w:val="22"/>
+              </w:rPr>
+              <w:t>Responses</w:t>
+            </w:r>
+          </w:p>
+        </w:tc>
+        <w:tc>
+          <w:tcPr>
+            <w:tcW w:type="dxa" w:w="2160"/>
+            <w:shd w:fill="1F3864"/>
+          </w:tcPr>
+          <w:p>
+            <w:pPr>
+              <w:jc w:val="center"/>
+            </w:pPr>
+            <w:r/>
+            <w:r>
+              <w:rPr>
+                <w:b/>
+                <w:color w:val="FFFFFF"/>
+                <w:sz w:val="22"/>
+              </w:rPr>
+              <w:t>%</w:t>
+            </w:r>
+          </w:p>
+        </w:tc>
+      </w:tr>
+      <w:tr>
+        <w:tc>
+          <w:tcPr>
+            <w:tcW w:type="dxa" w:w="3600"/>
+          </w:tcPr>
+          <w:p>
+            <w:r/>
+            <w:r>
+              <w:rPr>
+                <w:sz w:val="20"/>
+              </w:rPr>
+              <w:t>Mr. Adnan Zafar</w:t>
             </w:r>
           </w:p>
         </w:tc>
@@ -353,8 +374,64 @@
             <w:tcW w:type="dxa" w:w="2880"/>
           </w:tcPr>
           <w:p>
+            <w:r/>
             <w:r>
-              <w:t>Responses</w:t>
+              <w:rPr>
+                <w:sz w:val="20"/>
+              </w:rPr>
+              <w:t>Computer Science</w:t>
+            </w:r>
+          </w:p>
+        </w:tc>
+        <w:tc>
+          <w:tcPr>
+            <w:tcW w:type="dxa" w:w="1728"/>
+          </w:tcPr>
+          <w:p>
+            <w:pPr>
+              <w:jc w:val="center"/>
+            </w:pPr>
+            <w:r/>
+            <w:r>
+              <w:rPr>
+                <w:sz w:val="20"/>
+              </w:rPr>
+              <w:t>6</w:t>
+            </w:r>
+          </w:p>
+        </w:tc>
+        <w:tc>
+          <w:tcPr>
+            <w:tcW w:type="dxa" w:w="1152"/>
+          </w:tcPr>
+          <w:p>
+            <w:pPr>
+              <w:jc w:val="center"/>
+            </w:pPr>
+            <w:r/>
+            <w:r>
+              <w:rPr>
+                <w:b/>
+                <w:color w:val="BF8F00"/>
+                <w:sz w:val="20"/>
+              </w:rPr>
+              <w:t>23%</w:t>
+            </w:r>
+          </w:p>
+        </w:tc>
+      </w:tr>
+      <w:tr>
+        <w:tc>
+          <w:tcPr>
+            <w:tcW w:type="dxa" w:w="3600"/>
+          </w:tcPr>
+          <w:p>
+            <w:r/>
+            <w:r>
+              <w:rPr>
+                <w:sz w:val="20"/>
+              </w:rPr>
+              <w:t>Mr. Kamran Rasheed</w:t>
             </w:r>
           </w:p>
         </w:tc>
@@ -363,8 +440,48 @@
             <w:tcW w:type="dxa" w:w="2880"/>
           </w:tcPr>
           <w:p>
+            <w:r/>
             <w:r>
-              <w:t>Percentage</w:t>
+              <w:rPr>
+                <w:sz w:val="20"/>
+              </w:rPr>
+              <w:t>Physics</w:t>
+            </w:r>
+          </w:p>
+        </w:tc>
+        <w:tc>
+          <w:tcPr>
+            <w:tcW w:type="dxa" w:w="1728"/>
+          </w:tcPr>
+          <w:p>
+            <w:pPr>
+              <w:jc w:val="center"/>
+            </w:pPr>
+            <w:r/>
+            <w:r>
+              <w:rPr>
+                <w:sz w:val="20"/>
+              </w:rPr>
+              <w:t>5</w:t>
+            </w:r>
+          </w:p>
+        </w:tc>
+        <w:tc>
+          <w:tcPr>
+            <w:tcW w:type="dxa" w:w="1152"/>
+          </w:tcPr>
+          <w:p>
+            <w:pPr>
+              <w:jc w:val="center"/>
+            </w:pPr>
+            <w:r/>
+            <w:r>
+              <w:rPr>
+                <w:b/>
+                <w:color w:val="BF8F00"/>
+                <w:sz w:val="20"/>
+              </w:rPr>
+              <w:t>19%</w:t>
             </w:r>
           </w:p>
         </w:tc>
@@ -372,11 +489,15 @@
       <w:tr>
         <w:tc>
           <w:tcPr>
-            <w:tcW w:type="dxa" w:w="2880"/>
+            <w:tcW w:type="dxa" w:w="3600"/>
           </w:tcPr>
           <w:p>
+            <w:r/>
             <w:r>
-              <w:t>Ms. Alishba Maryum - Computing</w:t>
+              <w:rPr>
+                <w:sz w:val="20"/>
+              </w:rPr>
+              <w:t>Mr. Mohsin Saleem</w:t>
             </w:r>
           </w:p>
         </w:tc>
@@ -385,8 +506,64 @@
             <w:tcW w:type="dxa" w:w="2880"/>
           </w:tcPr>
           <w:p>
+            <w:r/>
             <w:r>
-              <w:t>6</w:t>
+              <w:rPr>
+                <w:sz w:val="20"/>
+              </w:rPr>
+              <w:t>Chemistry</w:t>
+            </w:r>
+          </w:p>
+        </w:tc>
+        <w:tc>
+          <w:tcPr>
+            <w:tcW w:type="dxa" w:w="1728"/>
+          </w:tcPr>
+          <w:p>
+            <w:pPr>
+              <w:jc w:val="center"/>
+            </w:pPr>
+            <w:r/>
+            <w:r>
+              <w:rPr>
+                <w:sz w:val="20"/>
+              </w:rPr>
+              <w:t>12</w:t>
+            </w:r>
+          </w:p>
+        </w:tc>
+        <w:tc>
+          <w:tcPr>
+            <w:tcW w:type="dxa" w:w="1152"/>
+          </w:tcPr>
+          <w:p>
+            <w:pPr>
+              <w:jc w:val="center"/>
+            </w:pPr>
+            <w:r/>
+            <w:r>
+              <w:rPr>
+                <w:b/>
+                <w:color w:val="BF8F00"/>
+                <w:sz w:val="20"/>
+              </w:rPr>
+              <w:t>46%</w:t>
+            </w:r>
+          </w:p>
+        </w:tc>
+      </w:tr>
+      <w:tr>
+        <w:tc>
+          <w:tcPr>
+            <w:tcW w:type="dxa" w:w="3600"/>
+          </w:tcPr>
+          <w:p>
+            <w:r/>
+            <w:r>
+              <w:rPr>
+                <w:sz w:val="20"/>
+              </w:rPr>
+              <w:t>Mr. Najam Ul Hassan</w:t>
             </w:r>
           </w:p>
         </w:tc>
@@ -395,8 +572,48 @@
             <w:tcW w:type="dxa" w:w="2880"/>
           </w:tcPr>
           <w:p>
+            <w:r/>
             <w:r>
-              <w:t>21.4%</w:t>
+              <w:rPr>
+                <w:sz w:val="20"/>
+              </w:rPr>
+              <w:t>Math</w:t>
+            </w:r>
+          </w:p>
+        </w:tc>
+        <w:tc>
+          <w:tcPr>
+            <w:tcW w:type="dxa" w:w="1728"/>
+          </w:tcPr>
+          <w:p>
+            <w:pPr>
+              <w:jc w:val="center"/>
+            </w:pPr>
+            <w:r/>
+            <w:r>
+              <w:rPr>
+                <w:sz w:val="20"/>
+              </w:rPr>
+              <w:t>14</w:t>
+            </w:r>
+          </w:p>
+        </w:tc>
+        <w:tc>
+          <w:tcPr>
+            <w:tcW w:type="dxa" w:w="1152"/>
+          </w:tcPr>
+          <w:p>
+            <w:pPr>
+              <w:jc w:val="center"/>
+            </w:pPr>
+            <w:r/>
+            <w:r>
+              <w:rPr>
+                <w:b/>
+                <w:color w:val="BF8F00"/>
+                <w:sz w:val="20"/>
+              </w:rPr>
+              <w:t>54%</w:t>
             </w:r>
           </w:p>
         </w:tc>
@@ -404,11 +621,15 @@
       <w:tr>
         <w:tc>
           <w:tcPr>
-            <w:tcW w:type="dxa" w:w="2880"/>
+            <w:tcW w:type="dxa" w:w="3600"/>
           </w:tcPr>
           <w:p>
+            <w:r/>
             <w:r>
-              <w:t>Ms. Ayesha Babar - English</w:t>
+              <w:rPr>
+                <w:sz w:val="20"/>
+              </w:rPr>
+              <w:t>Ms. Bushra Abbas</w:t>
             </w:r>
           </w:p>
         </w:tc>
@@ -417,8 +638,64 @@
             <w:tcW w:type="dxa" w:w="2880"/>
           </w:tcPr>
           <w:p>
+            <w:r/>
             <w:r>
-              <w:t>1</w:t>
+              <w:rPr>
+                <w:sz w:val="20"/>
+              </w:rPr>
+              <w:t>English</w:t>
+            </w:r>
+          </w:p>
+        </w:tc>
+        <w:tc>
+          <w:tcPr>
+            <w:tcW w:type="dxa" w:w="1728"/>
+          </w:tcPr>
+          <w:p>
+            <w:pPr>
+              <w:jc w:val="center"/>
+            </w:pPr>
+            <w:r/>
+            <w:r>
+              <w:rPr>
+                <w:sz w:val="20"/>
+              </w:rPr>
+              <w:t>8</w:t>
+            </w:r>
+          </w:p>
+        </w:tc>
+        <w:tc>
+          <w:tcPr>
+            <w:tcW w:type="dxa" w:w="1152"/>
+          </w:tcPr>
+          <w:p>
+            <w:pPr>
+              <w:jc w:val="center"/>
+            </w:pPr>
+            <w:r/>
+            <w:r>
+              <w:rPr>
+                <w:b/>
+                <w:color w:val="BF8F00"/>
+                <w:sz w:val="20"/>
+              </w:rPr>
+              <w:t>31%</w:t>
+            </w:r>
+          </w:p>
+        </w:tc>
+      </w:tr>
+      <w:tr>
+        <w:tc>
+          <w:tcPr>
+            <w:tcW w:type="dxa" w:w="3600"/>
+          </w:tcPr>
+          <w:p>
+            <w:r/>
+            <w:r>
+              <w:rPr>
+                <w:sz w:val="20"/>
+              </w:rPr>
+              <w:t>None of the above</w:t>
             </w:r>
           </w:p>
         </w:tc>
@@ -427,216 +704,67 @@
             <w:tcW w:type="dxa" w:w="2880"/>
           </w:tcPr>
           <w:p>
+            <w:r/>
             <w:r>
-              <w:t>3.6%</w:t>
-            </w:r>
-          </w:p>
-        </w:tc>
-      </w:tr>
-      <w:tr>
-        <w:tc>
-          <w:tcPr>
-            <w:tcW w:type="dxa" w:w="2880"/>
-          </w:tcPr>
-          <w:p>
-            <w:r>
-              <w:t>Ms. Kulsoom Khan - Science</w:t>
+              <w:rPr>
+                <w:sz w:val="20"/>
+              </w:rPr>
+              <w:t>-</w:t>
             </w:r>
           </w:p>
         </w:tc>
         <w:tc>
           <w:tcPr>
-            <w:tcW w:type="dxa" w:w="2880"/>
+            <w:tcW w:type="dxa" w:w="1728"/>
           </w:tcPr>
           <w:p>
+            <w:pPr>
+              <w:jc w:val="center"/>
+            </w:pPr>
+            <w:r/>
             <w:r>
-              <w:t>2</w:t>
-            </w:r>
-          </w:p>
-        </w:tc>
-        <w:tc>
-          <w:tcPr>
-            <w:tcW w:type="dxa" w:w="2880"/>
-          </w:tcPr>
-          <w:p>
-            <w:r>
-              <w:t>7.1%</w:t>
-            </w:r>
-          </w:p>
-        </w:tc>
-      </w:tr>
-      <w:tr>
-        <w:tc>
-          <w:tcPr>
-            <w:tcW w:type="dxa" w:w="2880"/>
-          </w:tcPr>
-          <w:p>
-            <w:r>
-              <w:t>Ms. Maria Yaqoob - GP</w:t>
-            </w:r>
-          </w:p>
-        </w:tc>
-        <w:tc>
-          <w:tcPr>
-            <w:tcW w:type="dxa" w:w="2880"/>
-          </w:tcPr>
-          <w:p>
-            <w:r>
-              <w:t>6</w:t>
-            </w:r>
-          </w:p>
-        </w:tc>
-        <w:tc>
-          <w:tcPr>
-            <w:tcW w:type="dxa" w:w="2880"/>
-          </w:tcPr>
-          <w:p>
-            <w:r>
-              <w:t>21.4%</w:t>
-            </w:r>
-          </w:p>
-        </w:tc>
-      </w:tr>
-      <w:tr>
-        <w:tc>
-          <w:tcPr>
-            <w:tcW w:type="dxa" w:w="2880"/>
-          </w:tcPr>
-          <w:p>
-            <w:r>
-              <w:t>Ms. Raiha Batool - Maths</w:t>
-            </w:r>
-          </w:p>
-        </w:tc>
-        <w:tc>
-          <w:tcPr>
-            <w:tcW w:type="dxa" w:w="2880"/>
-          </w:tcPr>
-          <w:p>
-            <w:r>
-              <w:t>0</w:t>
-            </w:r>
-          </w:p>
-        </w:tc>
-        <w:tc>
-          <w:tcPr>
-            <w:tcW w:type="dxa" w:w="2880"/>
-          </w:tcPr>
-          <w:p>
-            <w:r>
-              <w:t>0.0%</w:t>
-            </w:r>
-          </w:p>
-        </w:tc>
-      </w:tr>
-      <w:tr>
-        <w:tc>
-          <w:tcPr>
-            <w:tcW w:type="dxa" w:w="2880"/>
-          </w:tcPr>
-          <w:p>
-            <w:r>
-              <w:t>Ms. Samira Naveed - Urdu</w:t>
-            </w:r>
-          </w:p>
-        </w:tc>
-        <w:tc>
-          <w:tcPr>
-            <w:tcW w:type="dxa" w:w="2880"/>
-          </w:tcPr>
-          <w:p>
-            <w:r>
+              <w:rPr>
+                <w:sz w:val="20"/>
+              </w:rPr>
               <w:t>3</w:t>
             </w:r>
           </w:p>
         </w:tc>
         <w:tc>
           <w:tcPr>
-            <w:tcW w:type="dxa" w:w="2880"/>
+            <w:tcW w:type="dxa" w:w="1152"/>
           </w:tcPr>
           <w:p>
+            <w:pPr>
+              <w:jc w:val="center"/>
+            </w:pPr>
+            <w:r/>
             <w:r>
-              <w:t>10.7%</w:t>
-            </w:r>
-          </w:p>
-        </w:tc>
-      </w:tr>
-      <w:tr>
-        <w:tc>
-          <w:tcPr>
-            <w:tcW w:type="dxa" w:w="2880"/>
-          </w:tcPr>
-          <w:p>
-            <w:r>
-              <w:t>Ms. Summia Naz - Islamiat</w:t>
-            </w:r>
-          </w:p>
-        </w:tc>
-        <w:tc>
-          <w:tcPr>
-            <w:tcW w:type="dxa" w:w="2880"/>
-          </w:tcPr>
-          <w:p>
-            <w:r>
-              <w:t>2</w:t>
-            </w:r>
-          </w:p>
-        </w:tc>
-        <w:tc>
-          <w:tcPr>
-            <w:tcW w:type="dxa" w:w="2880"/>
-          </w:tcPr>
-          <w:p>
-            <w:r>
-              <w:t>7.1%</w:t>
-            </w:r>
-          </w:p>
-        </w:tc>
-      </w:tr>
-      <w:tr>
-        <w:tc>
-          <w:tcPr>
-            <w:tcW w:type="dxa" w:w="2880"/>
-          </w:tcPr>
-          <w:p>
-            <w:r>
-              <w:t>No One</w:t>
-            </w:r>
-          </w:p>
-        </w:tc>
-        <w:tc>
-          <w:tcPr>
-            <w:tcW w:type="dxa" w:w="2880"/>
-          </w:tcPr>
-          <w:p>
-            <w:r>
-              <w:t>8</w:t>
-            </w:r>
-          </w:p>
-        </w:tc>
-        <w:tc>
-          <w:tcPr>
-            <w:tcW w:type="dxa" w:w="2880"/>
-          </w:tcPr>
-          <w:p>
-            <w:r>
-              <w:t>28.6%</w:t>
+              <w:rPr>
+                <w:b/>
+                <w:color w:val="BF8F00"/>
+                <w:sz w:val="20"/>
+              </w:rPr>
+              <w:t>12%</w:t>
             </w:r>
           </w:p>
         </w:tc>
       </w:tr>
     </w:tbl>
+    <w:p/>
     <w:p>
       <w:r>
-        <w:br w:type="page"/>
+        <w:rPr>
+          <w:b/>
+          <w:color w:val="1F3864"/>
+          <w:sz w:val="22"/>
+        </w:rPr>
+        <w:t>Q2 Which teachers come late to class?</w:t>
       </w:r>
     </w:p>
     <w:p>
-      <w:pPr>
-        <w:pStyle w:val="Heading2"/>
-      </w:pPr>
       <w:r>
-        <w:t>Q#3 Which of your teachers do not check notebooks regularly? *You may Select as many options as you like.</w:t>
+        <w:t>____________________________________________________________________________________________________</w:t>
       </w:r>
     </w:p>
     <w:tbl>
@@ -653,18 +781,105 @@
         </w:tblBorders>
       </w:tblPr>
       <w:tblGrid>
+        <w:gridCol w:w="3600"/>
         <w:gridCol w:w="2880"/>
-        <w:gridCol w:w="2880"/>
-        <w:gridCol w:w="2880"/>
+        <w:gridCol w:w="1728"/>
+        <w:gridCol w:w="1152"/>
       </w:tblGrid>
       <w:tr>
         <w:tc>
           <w:tcPr>
-            <w:tcW w:type="dxa" w:w="2880"/>
+            <w:tcW w:type="dxa" w:w="2160"/>
+            <w:shd w:fill="1F3864"/>
           </w:tcPr>
           <w:p>
+            <w:pPr>
+              <w:jc w:val="center"/>
+            </w:pPr>
+            <w:r/>
             <w:r>
+              <w:rPr>
+                <w:b/>
+                <w:color w:val="FFFFFF"/>
+                <w:sz w:val="22"/>
+              </w:rPr>
               <w:t>Teacher</w:t>
+            </w:r>
+          </w:p>
+        </w:tc>
+        <w:tc>
+          <w:tcPr>
+            <w:tcW w:type="dxa" w:w="2160"/>
+            <w:shd w:fill="1F3864"/>
+          </w:tcPr>
+          <w:p>
+            <w:pPr>
+              <w:jc w:val="center"/>
+            </w:pPr>
+            <w:r/>
+            <w:r>
+              <w:rPr>
+                <w:b/>
+                <w:color w:val="FFFFFF"/>
+                <w:sz w:val="22"/>
+              </w:rPr>
+              <w:t>Subject</w:t>
+            </w:r>
+          </w:p>
+        </w:tc>
+        <w:tc>
+          <w:tcPr>
+            <w:tcW w:type="dxa" w:w="2160"/>
+            <w:shd w:fill="1F3864"/>
+          </w:tcPr>
+          <w:p>
+            <w:pPr>
+              <w:jc w:val="center"/>
+            </w:pPr>
+            <w:r/>
+            <w:r>
+              <w:rPr>
+                <w:b/>
+                <w:color w:val="FFFFFF"/>
+                <w:sz w:val="22"/>
+              </w:rPr>
+              <w:t>Responses</w:t>
+            </w:r>
+          </w:p>
+        </w:tc>
+        <w:tc>
+          <w:tcPr>
+            <w:tcW w:type="dxa" w:w="2160"/>
+            <w:shd w:fill="1F3864"/>
+          </w:tcPr>
+          <w:p>
+            <w:pPr>
+              <w:jc w:val="center"/>
+            </w:pPr>
+            <w:r/>
+            <w:r>
+              <w:rPr>
+                <w:b/>
+                <w:color w:val="FFFFFF"/>
+                <w:sz w:val="22"/>
+              </w:rPr>
+              <w:t>%</w:t>
+            </w:r>
+          </w:p>
+        </w:tc>
+      </w:tr>
+      <w:tr>
+        <w:tc>
+          <w:tcPr>
+            <w:tcW w:type="dxa" w:w="3600"/>
+          </w:tcPr>
+          <w:p>
+            <w:r/>
+            <w:r>
+              <w:rPr>
+                <w:sz w:val="20"/>
+              </w:rPr>
+              <w:t>Mr. Adnan Zafar</w:t>
             </w:r>
           </w:p>
         </w:tc>
@@ -673,8 +888,64 @@
             <w:tcW w:type="dxa" w:w="2880"/>
           </w:tcPr>
           <w:p>
+            <w:r/>
             <w:r>
-              <w:t>Responses</w:t>
+              <w:rPr>
+                <w:sz w:val="20"/>
+              </w:rPr>
+              <w:t>Computer Science</w:t>
+            </w:r>
+          </w:p>
+        </w:tc>
+        <w:tc>
+          <w:tcPr>
+            <w:tcW w:type="dxa" w:w="1728"/>
+          </w:tcPr>
+          <w:p>
+            <w:pPr>
+              <w:jc w:val="center"/>
+            </w:pPr>
+            <w:r/>
+            <w:r>
+              <w:rPr>
+                <w:sz w:val="20"/>
+              </w:rPr>
+              <w:t>0</w:t>
+            </w:r>
+          </w:p>
+        </w:tc>
+        <w:tc>
+          <w:tcPr>
+            <w:tcW w:type="dxa" w:w="1152"/>
+          </w:tcPr>
+          <w:p>
+            <w:pPr>
+              <w:jc w:val="center"/>
+            </w:pPr>
+            <w:r/>
+            <w:r>
+              <w:rPr>
+                <w:b/>
+                <w:color w:val="BF8F00"/>
+                <w:sz w:val="20"/>
+              </w:rPr>
+              <w:t>0%</w:t>
+            </w:r>
+          </w:p>
+        </w:tc>
+      </w:tr>
+      <w:tr>
+        <w:tc>
+          <w:tcPr>
+            <w:tcW w:type="dxa" w:w="3600"/>
+          </w:tcPr>
+          <w:p>
+            <w:r/>
+            <w:r>
+              <w:rPr>
+                <w:sz w:val="20"/>
+              </w:rPr>
+              <w:t>Mr. Kamran Rasheed</w:t>
             </w:r>
           </w:p>
         </w:tc>
@@ -683,8 +954,48 @@
             <w:tcW w:type="dxa" w:w="2880"/>
           </w:tcPr>
           <w:p>
+            <w:r/>
             <w:r>
-              <w:t>Percentage</w:t>
+              <w:rPr>
+                <w:sz w:val="20"/>
+              </w:rPr>
+              <w:t>Physics</w:t>
+            </w:r>
+          </w:p>
+        </w:tc>
+        <w:tc>
+          <w:tcPr>
+            <w:tcW w:type="dxa" w:w="1728"/>
+          </w:tcPr>
+          <w:p>
+            <w:pPr>
+              <w:jc w:val="center"/>
+            </w:pPr>
+            <w:r/>
+            <w:r>
+              <w:rPr>
+                <w:sz w:val="20"/>
+              </w:rPr>
+              <w:t>12</w:t>
+            </w:r>
+          </w:p>
+        </w:tc>
+        <w:tc>
+          <w:tcPr>
+            <w:tcW w:type="dxa" w:w="1152"/>
+          </w:tcPr>
+          <w:p>
+            <w:pPr>
+              <w:jc w:val="center"/>
+            </w:pPr>
+            <w:r/>
+            <w:r>
+              <w:rPr>
+                <w:b/>
+                <w:color w:val="BF8F00"/>
+                <w:sz w:val="20"/>
+              </w:rPr>
+              <w:t>46%</w:t>
             </w:r>
           </w:p>
         </w:tc>
@@ -692,11 +1003,15 @@
       <w:tr>
         <w:tc>
           <w:tcPr>
-            <w:tcW w:type="dxa" w:w="2880"/>
+            <w:tcW w:type="dxa" w:w="3600"/>
           </w:tcPr>
           <w:p>
+            <w:r/>
             <w:r>
-              <w:t>Ms. Alishba Maryum - Computing</w:t>
+              <w:rPr>
+                <w:sz w:val="20"/>
+              </w:rPr>
+              <w:t>Mr. Mohsin Saleem</w:t>
             </w:r>
           </w:p>
         </w:tc>
@@ -705,8 +1020,64 @@
             <w:tcW w:type="dxa" w:w="2880"/>
           </w:tcPr>
           <w:p>
+            <w:r/>
             <w:r>
-              <w:t>2</w:t>
+              <w:rPr>
+                <w:sz w:val="20"/>
+              </w:rPr>
+              <w:t>Chemistry</w:t>
+            </w:r>
+          </w:p>
+        </w:tc>
+        <w:tc>
+          <w:tcPr>
+            <w:tcW w:type="dxa" w:w="1728"/>
+          </w:tcPr>
+          <w:p>
+            <w:pPr>
+              <w:jc w:val="center"/>
+            </w:pPr>
+            <w:r/>
+            <w:r>
+              <w:rPr>
+                <w:sz w:val="20"/>
+              </w:rPr>
+              <w:t>0</w:t>
+            </w:r>
+          </w:p>
+        </w:tc>
+        <w:tc>
+          <w:tcPr>
+            <w:tcW w:type="dxa" w:w="1152"/>
+          </w:tcPr>
+          <w:p>
+            <w:pPr>
+              <w:jc w:val="center"/>
+            </w:pPr>
+            <w:r/>
+            <w:r>
+              <w:rPr>
+                <w:b/>
+                <w:color w:val="BF8F00"/>
+                <w:sz w:val="20"/>
+              </w:rPr>
+              <w:t>0%</w:t>
+            </w:r>
+          </w:p>
+        </w:tc>
+      </w:tr>
+      <w:tr>
+        <w:tc>
+          <w:tcPr>
+            <w:tcW w:type="dxa" w:w="3600"/>
+          </w:tcPr>
+          <w:p>
+            <w:r/>
+            <w:r>
+              <w:rPr>
+                <w:sz w:val="20"/>
+              </w:rPr>
+              <w:t>Mr. Najam Ul Hassan</w:t>
             </w:r>
           </w:p>
         </w:tc>
@@ -715,8 +1086,48 @@
             <w:tcW w:type="dxa" w:w="2880"/>
           </w:tcPr>
           <w:p>
+            <w:r/>
             <w:r>
-              <w:t>16.7%</w:t>
+              <w:rPr>
+                <w:sz w:val="20"/>
+              </w:rPr>
+              <w:t>Math</w:t>
+            </w:r>
+          </w:p>
+        </w:tc>
+        <w:tc>
+          <w:tcPr>
+            <w:tcW w:type="dxa" w:w="1728"/>
+          </w:tcPr>
+          <w:p>
+            <w:pPr>
+              <w:jc w:val="center"/>
+            </w:pPr>
+            <w:r/>
+            <w:r>
+              <w:rPr>
+                <w:sz w:val="20"/>
+              </w:rPr>
+              <w:t>1</w:t>
+            </w:r>
+          </w:p>
+        </w:tc>
+        <w:tc>
+          <w:tcPr>
+            <w:tcW w:type="dxa" w:w="1152"/>
+          </w:tcPr>
+          <w:p>
+            <w:pPr>
+              <w:jc w:val="center"/>
+            </w:pPr>
+            <w:r/>
+            <w:r>
+              <w:rPr>
+                <w:b/>
+                <w:color w:val="BF8F00"/>
+                <w:sz w:val="20"/>
+              </w:rPr>
+              <w:t>4%</w:t>
             </w:r>
           </w:p>
         </w:tc>
@@ -724,11 +1135,15 @@
       <w:tr>
         <w:tc>
           <w:tcPr>
-            <w:tcW w:type="dxa" w:w="2880"/>
+            <w:tcW w:type="dxa" w:w="3600"/>
           </w:tcPr>
           <w:p>
+            <w:r/>
             <w:r>
-              <w:t>Ms. Ayesha Babar - English</w:t>
+              <w:rPr>
+                <w:sz w:val="20"/>
+              </w:rPr>
+              <w:t>Ms. Bushra Abbas</w:t>
             </w:r>
           </w:p>
         </w:tc>
@@ -737,8 +1152,64 @@
             <w:tcW w:type="dxa" w:w="2880"/>
           </w:tcPr>
           <w:p>
+            <w:r/>
             <w:r>
+              <w:rPr>
+                <w:sz w:val="20"/>
+              </w:rPr>
+              <w:t>English</w:t>
+            </w:r>
+          </w:p>
+        </w:tc>
+        <w:tc>
+          <w:tcPr>
+            <w:tcW w:type="dxa" w:w="1728"/>
+          </w:tcPr>
+          <w:p>
+            <w:pPr>
+              <w:jc w:val="center"/>
+            </w:pPr>
+            <w:r/>
+            <w:r>
+              <w:rPr>
+                <w:sz w:val="20"/>
+              </w:rPr>
               <w:t>1</w:t>
+            </w:r>
+          </w:p>
+        </w:tc>
+        <w:tc>
+          <w:tcPr>
+            <w:tcW w:type="dxa" w:w="1152"/>
+          </w:tcPr>
+          <w:p>
+            <w:pPr>
+              <w:jc w:val="center"/>
+            </w:pPr>
+            <w:r/>
+            <w:r>
+              <w:rPr>
+                <w:b/>
+                <w:color w:val="BF8F00"/>
+                <w:sz w:val="20"/>
+              </w:rPr>
+              <w:t>4%</w:t>
+            </w:r>
+          </w:p>
+        </w:tc>
+      </w:tr>
+      <w:tr>
+        <w:tc>
+          <w:tcPr>
+            <w:tcW w:type="dxa" w:w="3600"/>
+          </w:tcPr>
+          <w:p>
+            <w:r/>
+            <w:r>
+              <w:rPr>
+                <w:sz w:val="20"/>
+              </w:rPr>
+              <w:t>None of the above</w:t>
             </w:r>
           </w:p>
         </w:tc>
@@ -747,184 +1218,67 @@
             <w:tcW w:type="dxa" w:w="2880"/>
           </w:tcPr>
           <w:p>
+            <w:r/>
             <w:r>
-              <w:t>8.3%</w:t>
-            </w:r>
-          </w:p>
-        </w:tc>
-      </w:tr>
-      <w:tr>
-        <w:tc>
-          <w:tcPr>
-            <w:tcW w:type="dxa" w:w="2880"/>
-          </w:tcPr>
-          <w:p>
-            <w:r>
-              <w:t>Ms. Kulsoom Khan - Science</w:t>
+              <w:rPr>
+                <w:sz w:val="20"/>
+              </w:rPr>
+              <w:t>-</w:t>
             </w:r>
           </w:p>
         </w:tc>
         <w:tc>
           <w:tcPr>
-            <w:tcW w:type="dxa" w:w="2880"/>
+            <w:tcW w:type="dxa" w:w="1728"/>
           </w:tcPr>
           <w:p>
+            <w:pPr>
+              <w:jc w:val="center"/>
+            </w:pPr>
+            <w:r/>
             <w:r>
-              <w:t>0</w:t>
+              <w:rPr>
+                <w:sz w:val="20"/>
+              </w:rPr>
+              <w:t>7</w:t>
             </w:r>
           </w:p>
         </w:tc>
         <w:tc>
           <w:tcPr>
-            <w:tcW w:type="dxa" w:w="2880"/>
+            <w:tcW w:type="dxa" w:w="1152"/>
           </w:tcPr>
           <w:p>
+            <w:pPr>
+              <w:jc w:val="center"/>
+            </w:pPr>
+            <w:r/>
             <w:r>
-              <w:t>0.0%</w:t>
-            </w:r>
-          </w:p>
-        </w:tc>
-      </w:tr>
-      <w:tr>
-        <w:tc>
-          <w:tcPr>
-            <w:tcW w:type="dxa" w:w="2880"/>
-          </w:tcPr>
-          <w:p>
-            <w:r>
-              <w:t>Ms. Maria Yaqoob - GP</w:t>
-            </w:r>
-          </w:p>
-        </w:tc>
-        <w:tc>
-          <w:tcPr>
-            <w:tcW w:type="dxa" w:w="2880"/>
-          </w:tcPr>
-          <w:p>
-            <w:r>
-              <w:t>3</w:t>
-            </w:r>
-          </w:p>
-        </w:tc>
-        <w:tc>
-          <w:tcPr>
-            <w:tcW w:type="dxa" w:w="2880"/>
-          </w:tcPr>
-          <w:p>
-            <w:r>
-              <w:t>25.0%</w:t>
-            </w:r>
-          </w:p>
-        </w:tc>
-      </w:tr>
-      <w:tr>
-        <w:tc>
-          <w:tcPr>
-            <w:tcW w:type="dxa" w:w="2880"/>
-          </w:tcPr>
-          <w:p>
-            <w:r>
-              <w:t>Ms. Raiha Batool - Maths</w:t>
-            </w:r>
-          </w:p>
-        </w:tc>
-        <w:tc>
-          <w:tcPr>
-            <w:tcW w:type="dxa" w:w="2880"/>
-          </w:tcPr>
-          <w:p>
-            <w:r>
-              <w:t>1</w:t>
-            </w:r>
-          </w:p>
-        </w:tc>
-        <w:tc>
-          <w:tcPr>
-            <w:tcW w:type="dxa" w:w="2880"/>
-          </w:tcPr>
-          <w:p>
-            <w:r>
-              <w:t>8.3%</w:t>
-            </w:r>
-          </w:p>
-        </w:tc>
-      </w:tr>
-      <w:tr>
-        <w:tc>
-          <w:tcPr>
-            <w:tcW w:type="dxa" w:w="2880"/>
-          </w:tcPr>
-          <w:p>
-            <w:r>
-              <w:t>Ms. Samira Naveed - Urdu</w:t>
-            </w:r>
-          </w:p>
-        </w:tc>
-        <w:tc>
-          <w:tcPr>
-            <w:tcW w:type="dxa" w:w="2880"/>
-          </w:tcPr>
-          <w:p>
-            <w:r>
-              <w:t>2</w:t>
-            </w:r>
-          </w:p>
-        </w:tc>
-        <w:tc>
-          <w:tcPr>
-            <w:tcW w:type="dxa" w:w="2880"/>
-          </w:tcPr>
-          <w:p>
-            <w:r>
-              <w:t>16.7%</w:t>
-            </w:r>
-          </w:p>
-        </w:tc>
-      </w:tr>
-      <w:tr>
-        <w:tc>
-          <w:tcPr>
-            <w:tcW w:type="dxa" w:w="2880"/>
-          </w:tcPr>
-          <w:p>
-            <w:r>
-              <w:t>Ms. Summia Naz - Islamiat</w:t>
-            </w:r>
-          </w:p>
-        </w:tc>
-        <w:tc>
-          <w:tcPr>
-            <w:tcW w:type="dxa" w:w="2880"/>
-          </w:tcPr>
-          <w:p>
-            <w:r>
-              <w:t>3</w:t>
-            </w:r>
-          </w:p>
-        </w:tc>
-        <w:tc>
-          <w:tcPr>
-            <w:tcW w:type="dxa" w:w="2880"/>
-          </w:tcPr>
-          <w:p>
-            <w:r>
-              <w:t>25.0%</w:t>
+              <w:rPr>
+                <w:b/>
+                <w:color w:val="BF8F00"/>
+                <w:sz w:val="20"/>
+              </w:rPr>
+              <w:t>27%</w:t>
             </w:r>
           </w:p>
         </w:tc>
       </w:tr>
     </w:tbl>
+    <w:p/>
     <w:p>
       <w:r>
-        <w:br w:type="page"/>
+        <w:rPr>
+          <w:b/>
+          <w:color w:val="1F3864"/>
+          <w:sz w:val="22"/>
+        </w:rPr>
+        <w:t>Q3 Which teachers finish their classes early and before the class time? (For example: if a class should end at 10:40 a.m. but the teacher</w:t>
       </w:r>
     </w:p>
     <w:p>
-      <w:pPr>
-        <w:pStyle w:val="Heading2"/>
-      </w:pPr>
       <w:r>
-        <w:t>Q#4 Which teachers do not appreciate when you ask questions during the lesson? *You may Select as many options as you lik</w:t>
+        <w:t>____________________________________________________________________________________________________</w:t>
       </w:r>
     </w:p>
     <w:tbl>
@@ -941,18 +1295,105 @@
         </w:tblBorders>
       </w:tblPr>
       <w:tblGrid>
+        <w:gridCol w:w="3600"/>
         <w:gridCol w:w="2880"/>
-        <w:gridCol w:w="2880"/>
-        <w:gridCol w:w="2880"/>
+        <w:gridCol w:w="1728"/>
+        <w:gridCol w:w="1152"/>
       </w:tblGrid>
       <w:tr>
         <w:tc>
           <w:tcPr>
-            <w:tcW w:type="dxa" w:w="2880"/>
+            <w:tcW w:type="dxa" w:w="2160"/>
+            <w:shd w:fill="1F3864"/>
           </w:tcPr>
           <w:p>
+            <w:pPr>
+              <w:jc w:val="center"/>
+            </w:pPr>
+            <w:r/>
             <w:r>
+              <w:rPr>
+                <w:b/>
+                <w:color w:val="FFFFFF"/>
+                <w:sz w:val="22"/>
+              </w:rPr>
               <w:t>Teacher</w:t>
+            </w:r>
+          </w:p>
+        </w:tc>
+        <w:tc>
+          <w:tcPr>
+            <w:tcW w:type="dxa" w:w="2160"/>
+            <w:shd w:fill="1F3864"/>
+          </w:tcPr>
+          <w:p>
+            <w:pPr>
+              <w:jc w:val="center"/>
+            </w:pPr>
+            <w:r/>
+            <w:r>
+              <w:rPr>
+                <w:b/>
+                <w:color w:val="FFFFFF"/>
+                <w:sz w:val="22"/>
+              </w:rPr>
+              <w:t>Subject</w:t>
+            </w:r>
+          </w:p>
+        </w:tc>
+        <w:tc>
+          <w:tcPr>
+            <w:tcW w:type="dxa" w:w="2160"/>
+            <w:shd w:fill="1F3864"/>
+          </w:tcPr>
+          <w:p>
+            <w:pPr>
+              <w:jc w:val="center"/>
+            </w:pPr>
+            <w:r/>
+            <w:r>
+              <w:rPr>
+                <w:b/>
+                <w:color w:val="FFFFFF"/>
+                <w:sz w:val="22"/>
+              </w:rPr>
+              <w:t>Responses</w:t>
+            </w:r>
+          </w:p>
+        </w:tc>
+        <w:tc>
+          <w:tcPr>
+            <w:tcW w:type="dxa" w:w="2160"/>
+            <w:shd w:fill="1F3864"/>
+          </w:tcPr>
+          <w:p>
+            <w:pPr>
+              <w:jc w:val="center"/>
+            </w:pPr>
+            <w:r/>
+            <w:r>
+              <w:rPr>
+                <w:b/>
+                <w:color w:val="FFFFFF"/>
+                <w:sz w:val="22"/>
+              </w:rPr>
+              <w:t>%</w:t>
+            </w:r>
+          </w:p>
+        </w:tc>
+      </w:tr>
+      <w:tr>
+        <w:tc>
+          <w:tcPr>
+            <w:tcW w:type="dxa" w:w="3600"/>
+          </w:tcPr>
+          <w:p>
+            <w:r/>
+            <w:r>
+              <w:rPr>
+                <w:sz w:val="20"/>
+              </w:rPr>
+              <w:t>Mr. Adnan Zafar</w:t>
             </w:r>
           </w:p>
         </w:tc>
@@ -961,8 +1402,64 @@
             <w:tcW w:type="dxa" w:w="2880"/>
           </w:tcPr>
           <w:p>
+            <w:r/>
             <w:r>
-              <w:t>Responses</w:t>
+              <w:rPr>
+                <w:sz w:val="20"/>
+              </w:rPr>
+              <w:t>Computer Science</w:t>
+            </w:r>
+          </w:p>
+        </w:tc>
+        <w:tc>
+          <w:tcPr>
+            <w:tcW w:type="dxa" w:w="1728"/>
+          </w:tcPr>
+          <w:p>
+            <w:pPr>
+              <w:jc w:val="center"/>
+            </w:pPr>
+            <w:r/>
+            <w:r>
+              <w:rPr>
+                <w:sz w:val="20"/>
+              </w:rPr>
+              <w:t>0</w:t>
+            </w:r>
+          </w:p>
+        </w:tc>
+        <w:tc>
+          <w:tcPr>
+            <w:tcW w:type="dxa" w:w="1152"/>
+          </w:tcPr>
+          <w:p>
+            <w:pPr>
+              <w:jc w:val="center"/>
+            </w:pPr>
+            <w:r/>
+            <w:r>
+              <w:rPr>
+                <w:b/>
+                <w:color w:val="BF8F00"/>
+                <w:sz w:val="20"/>
+              </w:rPr>
+              <w:t>0%</w:t>
+            </w:r>
+          </w:p>
+        </w:tc>
+      </w:tr>
+      <w:tr>
+        <w:tc>
+          <w:tcPr>
+            <w:tcW w:type="dxa" w:w="3600"/>
+          </w:tcPr>
+          <w:p>
+            <w:r/>
+            <w:r>
+              <w:rPr>
+                <w:sz w:val="20"/>
+              </w:rPr>
+              <w:t>Mr. Kamran Rasheed</w:t>
             </w:r>
           </w:p>
         </w:tc>
@@ -971,8 +1468,48 @@
             <w:tcW w:type="dxa" w:w="2880"/>
           </w:tcPr>
           <w:p>
+            <w:r/>
             <w:r>
-              <w:t>Percentage</w:t>
+              <w:rPr>
+                <w:sz w:val="20"/>
+              </w:rPr>
+              <w:t>Physics</w:t>
+            </w:r>
+          </w:p>
+        </w:tc>
+        <w:tc>
+          <w:tcPr>
+            <w:tcW w:type="dxa" w:w="1728"/>
+          </w:tcPr>
+          <w:p>
+            <w:pPr>
+              <w:jc w:val="center"/>
+            </w:pPr>
+            <w:r/>
+            <w:r>
+              <w:rPr>
+                <w:sz w:val="20"/>
+              </w:rPr>
+              <w:t>5</w:t>
+            </w:r>
+          </w:p>
+        </w:tc>
+        <w:tc>
+          <w:tcPr>
+            <w:tcW w:type="dxa" w:w="1152"/>
+          </w:tcPr>
+          <w:p>
+            <w:pPr>
+              <w:jc w:val="center"/>
+            </w:pPr>
+            <w:r/>
+            <w:r>
+              <w:rPr>
+                <w:b/>
+                <w:color w:val="BF8F00"/>
+                <w:sz w:val="20"/>
+              </w:rPr>
+              <w:t>19%</w:t>
             </w:r>
           </w:p>
         </w:tc>
@@ -980,11 +1517,15 @@
       <w:tr>
         <w:tc>
           <w:tcPr>
-            <w:tcW w:type="dxa" w:w="2880"/>
+            <w:tcW w:type="dxa" w:w="3600"/>
           </w:tcPr>
           <w:p>
+            <w:r/>
             <w:r>
-              <w:t>Ms. Alishba Maryum - Computing</w:t>
+              <w:rPr>
+                <w:sz w:val="20"/>
+              </w:rPr>
+              <w:t>Mr. Mohsin Saleem</w:t>
             </w:r>
           </w:p>
         </w:tc>
@@ -993,8 +1534,64 @@
             <w:tcW w:type="dxa" w:w="2880"/>
           </w:tcPr>
           <w:p>
+            <w:r/>
             <w:r>
-              <w:t>6</w:t>
+              <w:rPr>
+                <w:sz w:val="20"/>
+              </w:rPr>
+              <w:t>Chemistry</w:t>
+            </w:r>
+          </w:p>
+        </w:tc>
+        <w:tc>
+          <w:tcPr>
+            <w:tcW w:type="dxa" w:w="1728"/>
+          </w:tcPr>
+          <w:p>
+            <w:pPr>
+              <w:jc w:val="center"/>
+            </w:pPr>
+            <w:r/>
+            <w:r>
+              <w:rPr>
+                <w:sz w:val="20"/>
+              </w:rPr>
+              <w:t>0</w:t>
+            </w:r>
+          </w:p>
+        </w:tc>
+        <w:tc>
+          <w:tcPr>
+            <w:tcW w:type="dxa" w:w="1152"/>
+          </w:tcPr>
+          <w:p>
+            <w:pPr>
+              <w:jc w:val="center"/>
+            </w:pPr>
+            <w:r/>
+            <w:r>
+              <w:rPr>
+                <w:b/>
+                <w:color w:val="BF8F00"/>
+                <w:sz w:val="20"/>
+              </w:rPr>
+              <w:t>0%</w:t>
+            </w:r>
+          </w:p>
+        </w:tc>
+      </w:tr>
+      <w:tr>
+        <w:tc>
+          <w:tcPr>
+            <w:tcW w:type="dxa" w:w="3600"/>
+          </w:tcPr>
+          <w:p>
+            <w:r/>
+            <w:r>
+              <w:rPr>
+                <w:sz w:val="20"/>
+              </w:rPr>
+              <w:t>Mr. Najam Ul Hassan</w:t>
             </w:r>
           </w:p>
         </w:tc>
@@ -1003,8 +1600,48 @@
             <w:tcW w:type="dxa" w:w="2880"/>
           </w:tcPr>
           <w:p>
+            <w:r/>
             <w:r>
-              <w:t>46.2%</w:t>
+              <w:rPr>
+                <w:sz w:val="20"/>
+              </w:rPr>
+              <w:t>Math</w:t>
+            </w:r>
+          </w:p>
+        </w:tc>
+        <w:tc>
+          <w:tcPr>
+            <w:tcW w:type="dxa" w:w="1728"/>
+          </w:tcPr>
+          <w:p>
+            <w:pPr>
+              <w:jc w:val="center"/>
+            </w:pPr>
+            <w:r/>
+            <w:r>
+              <w:rPr>
+                <w:sz w:val="20"/>
+              </w:rPr>
+              <w:t>0</w:t>
+            </w:r>
+          </w:p>
+        </w:tc>
+        <w:tc>
+          <w:tcPr>
+            <w:tcW w:type="dxa" w:w="1152"/>
+          </w:tcPr>
+          <w:p>
+            <w:pPr>
+              <w:jc w:val="center"/>
+            </w:pPr>
+            <w:r/>
+            <w:r>
+              <w:rPr>
+                <w:b/>
+                <w:color w:val="BF8F00"/>
+                <w:sz w:val="20"/>
+              </w:rPr>
+              <w:t>0%</w:t>
             </w:r>
           </w:p>
         </w:tc>
@@ -1012,11 +1649,15 @@
       <w:tr>
         <w:tc>
           <w:tcPr>
-            <w:tcW w:type="dxa" w:w="2880"/>
+            <w:tcW w:type="dxa" w:w="3600"/>
           </w:tcPr>
           <w:p>
+            <w:r/>
             <w:r>
-              <w:t>Ms. Ayesha Babar - English</w:t>
+              <w:rPr>
+                <w:sz w:val="20"/>
+              </w:rPr>
+              <w:t>Ms. Bushra Abbas</w:t>
             </w:r>
           </w:p>
         </w:tc>
@@ -1025,8 +1666,64 @@
             <w:tcW w:type="dxa" w:w="2880"/>
           </w:tcPr>
           <w:p>
+            <w:r/>
             <w:r>
-              <w:t>0</w:t>
+              <w:rPr>
+                <w:sz w:val="20"/>
+              </w:rPr>
+              <w:t>English</w:t>
+            </w:r>
+          </w:p>
+        </w:tc>
+        <w:tc>
+          <w:tcPr>
+            <w:tcW w:type="dxa" w:w="1728"/>
+          </w:tcPr>
+          <w:p>
+            <w:pPr>
+              <w:jc w:val="center"/>
+            </w:pPr>
+            <w:r/>
+            <w:r>
+              <w:rPr>
+                <w:sz w:val="20"/>
+              </w:rPr>
+              <w:t>2</w:t>
+            </w:r>
+          </w:p>
+        </w:tc>
+        <w:tc>
+          <w:tcPr>
+            <w:tcW w:type="dxa" w:w="1152"/>
+          </w:tcPr>
+          <w:p>
+            <w:pPr>
+              <w:jc w:val="center"/>
+            </w:pPr>
+            <w:r/>
+            <w:r>
+              <w:rPr>
+                <w:b/>
+                <w:color w:val="BF8F00"/>
+                <w:sz w:val="20"/>
+              </w:rPr>
+              <w:t>8%</w:t>
+            </w:r>
+          </w:p>
+        </w:tc>
+      </w:tr>
+      <w:tr>
+        <w:tc>
+          <w:tcPr>
+            <w:tcW w:type="dxa" w:w="3600"/>
+          </w:tcPr>
+          <w:p>
+            <w:r/>
+            <w:r>
+              <w:rPr>
+                <w:sz w:val="20"/>
+              </w:rPr>
+              <w:t>None of the above</w:t>
             </w:r>
           </w:p>
         </w:tc>
@@ -1035,184 +1732,67 @@
             <w:tcW w:type="dxa" w:w="2880"/>
           </w:tcPr>
           <w:p>
+            <w:r/>
             <w:r>
-              <w:t>0.0%</w:t>
-            </w:r>
-          </w:p>
-        </w:tc>
-      </w:tr>
-      <w:tr>
-        <w:tc>
-          <w:tcPr>
-            <w:tcW w:type="dxa" w:w="2880"/>
-          </w:tcPr>
-          <w:p>
-            <w:r>
-              <w:t>Ms. Kulsoom Khan - Science</w:t>
+              <w:rPr>
+                <w:sz w:val="20"/>
+              </w:rPr>
+              <w:t>-</w:t>
             </w:r>
           </w:p>
         </w:tc>
         <w:tc>
           <w:tcPr>
-            <w:tcW w:type="dxa" w:w="2880"/>
+            <w:tcW w:type="dxa" w:w="1728"/>
           </w:tcPr>
           <w:p>
+            <w:pPr>
+              <w:jc w:val="center"/>
+            </w:pPr>
+            <w:r/>
             <w:r>
-              <w:t>1</w:t>
+              <w:rPr>
+                <w:sz w:val="20"/>
+              </w:rPr>
+              <w:t>14</w:t>
             </w:r>
           </w:p>
         </w:tc>
         <w:tc>
           <w:tcPr>
-            <w:tcW w:type="dxa" w:w="2880"/>
+            <w:tcW w:type="dxa" w:w="1152"/>
           </w:tcPr>
           <w:p>
+            <w:pPr>
+              <w:jc w:val="center"/>
+            </w:pPr>
+            <w:r/>
             <w:r>
-              <w:t>7.7%</w:t>
-            </w:r>
-          </w:p>
-        </w:tc>
-      </w:tr>
-      <w:tr>
-        <w:tc>
-          <w:tcPr>
-            <w:tcW w:type="dxa" w:w="2880"/>
-          </w:tcPr>
-          <w:p>
-            <w:r>
-              <w:t>Ms. Maria Yaqoob - GP</w:t>
-            </w:r>
-          </w:p>
-        </w:tc>
-        <w:tc>
-          <w:tcPr>
-            <w:tcW w:type="dxa" w:w="2880"/>
-          </w:tcPr>
-          <w:p>
-            <w:r>
-              <w:t>1</w:t>
-            </w:r>
-          </w:p>
-        </w:tc>
-        <w:tc>
-          <w:tcPr>
-            <w:tcW w:type="dxa" w:w="2880"/>
-          </w:tcPr>
-          <w:p>
-            <w:r>
-              <w:t>7.7%</w:t>
-            </w:r>
-          </w:p>
-        </w:tc>
-      </w:tr>
-      <w:tr>
-        <w:tc>
-          <w:tcPr>
-            <w:tcW w:type="dxa" w:w="2880"/>
-          </w:tcPr>
-          <w:p>
-            <w:r>
-              <w:t>Ms. Raiha Batool - Maths</w:t>
-            </w:r>
-          </w:p>
-        </w:tc>
-        <w:tc>
-          <w:tcPr>
-            <w:tcW w:type="dxa" w:w="2880"/>
-          </w:tcPr>
-          <w:p>
-            <w:r>
-              <w:t>1</w:t>
-            </w:r>
-          </w:p>
-        </w:tc>
-        <w:tc>
-          <w:tcPr>
-            <w:tcW w:type="dxa" w:w="2880"/>
-          </w:tcPr>
-          <w:p>
-            <w:r>
-              <w:t>7.7%</w:t>
-            </w:r>
-          </w:p>
-        </w:tc>
-      </w:tr>
-      <w:tr>
-        <w:tc>
-          <w:tcPr>
-            <w:tcW w:type="dxa" w:w="2880"/>
-          </w:tcPr>
-          <w:p>
-            <w:r>
-              <w:t>Ms. Samira Naveed - Urdu</w:t>
-            </w:r>
-          </w:p>
-        </w:tc>
-        <w:tc>
-          <w:tcPr>
-            <w:tcW w:type="dxa" w:w="2880"/>
-          </w:tcPr>
-          <w:p>
-            <w:r>
-              <w:t>3</w:t>
-            </w:r>
-          </w:p>
-        </w:tc>
-        <w:tc>
-          <w:tcPr>
-            <w:tcW w:type="dxa" w:w="2880"/>
-          </w:tcPr>
-          <w:p>
-            <w:r>
-              <w:t>23.1%</w:t>
-            </w:r>
-          </w:p>
-        </w:tc>
-      </w:tr>
-      <w:tr>
-        <w:tc>
-          <w:tcPr>
-            <w:tcW w:type="dxa" w:w="2880"/>
-          </w:tcPr>
-          <w:p>
-            <w:r>
-              <w:t>Ms. Summia Naz - Islamiat</w:t>
-            </w:r>
-          </w:p>
-        </w:tc>
-        <w:tc>
-          <w:tcPr>
-            <w:tcW w:type="dxa" w:w="2880"/>
-          </w:tcPr>
-          <w:p>
-            <w:r>
-              <w:t>1</w:t>
-            </w:r>
-          </w:p>
-        </w:tc>
-        <w:tc>
-          <w:tcPr>
-            <w:tcW w:type="dxa" w:w="2880"/>
-          </w:tcPr>
-          <w:p>
-            <w:r>
-              <w:t>7.7%</w:t>
+              <w:rPr>
+                <w:b/>
+                <w:color w:val="BF8F00"/>
+                <w:sz w:val="20"/>
+              </w:rPr>
+              <w:t>54%</w:t>
             </w:r>
           </w:p>
         </w:tc>
       </w:tr>
     </w:tbl>
+    <w:p/>
     <w:p>
       <w:r>
-        <w:br w:type="page"/>
+        <w:rPr>
+          <w:b/>
+          <w:color w:val="1F3864"/>
+          <w:sz w:val="22"/>
+        </w:rPr>
+        <w:t>Q4 Which teachers talk about things that are not related to the lesson?</w:t>
       </w:r>
     </w:p>
     <w:p>
-      <w:pPr>
-        <w:pStyle w:val="Heading2"/>
-      </w:pPr>
       <w:r>
-        <w:t>Q#5 Which teachers come late for the class? *You may Select as many options as you like.</w:t>
+        <w:t>____________________________________________________________________________________________________</w:t>
       </w:r>
     </w:p>
     <w:tbl>
@@ -1229,18 +1809,105 @@
         </w:tblBorders>
       </w:tblPr>
       <w:tblGrid>
+        <w:gridCol w:w="3600"/>
         <w:gridCol w:w="2880"/>
-        <w:gridCol w:w="2880"/>
-        <w:gridCol w:w="2880"/>
+        <w:gridCol w:w="1728"/>
+        <w:gridCol w:w="1152"/>
       </w:tblGrid>
       <w:tr>
         <w:tc>
           <w:tcPr>
-            <w:tcW w:type="dxa" w:w="2880"/>
+            <w:tcW w:type="dxa" w:w="2160"/>
+            <w:shd w:fill="1F3864"/>
           </w:tcPr>
           <w:p>
+            <w:pPr>
+              <w:jc w:val="center"/>
+            </w:pPr>
+            <w:r/>
             <w:r>
+              <w:rPr>
+                <w:b/>
+                <w:color w:val="FFFFFF"/>
+                <w:sz w:val="22"/>
+              </w:rPr>
               <w:t>Teacher</w:t>
+            </w:r>
+          </w:p>
+        </w:tc>
+        <w:tc>
+          <w:tcPr>
+            <w:tcW w:type="dxa" w:w="2160"/>
+            <w:shd w:fill="1F3864"/>
+          </w:tcPr>
+          <w:p>
+            <w:pPr>
+              <w:jc w:val="center"/>
+            </w:pPr>
+            <w:r/>
+            <w:r>
+              <w:rPr>
+                <w:b/>
+                <w:color w:val="FFFFFF"/>
+                <w:sz w:val="22"/>
+              </w:rPr>
+              <w:t>Subject</w:t>
+            </w:r>
+          </w:p>
+        </w:tc>
+        <w:tc>
+          <w:tcPr>
+            <w:tcW w:type="dxa" w:w="2160"/>
+            <w:shd w:fill="1F3864"/>
+          </w:tcPr>
+          <w:p>
+            <w:pPr>
+              <w:jc w:val="center"/>
+            </w:pPr>
+            <w:r/>
+            <w:r>
+              <w:rPr>
+                <w:b/>
+                <w:color w:val="FFFFFF"/>
+                <w:sz w:val="22"/>
+              </w:rPr>
+              <w:t>Responses</w:t>
+            </w:r>
+          </w:p>
+        </w:tc>
+        <w:tc>
+          <w:tcPr>
+            <w:tcW w:type="dxa" w:w="2160"/>
+            <w:shd w:fill="1F3864"/>
+          </w:tcPr>
+          <w:p>
+            <w:pPr>
+              <w:jc w:val="center"/>
+            </w:pPr>
+            <w:r/>
+            <w:r>
+              <w:rPr>
+                <w:b/>
+                <w:color w:val="FFFFFF"/>
+                <w:sz w:val="22"/>
+              </w:rPr>
+              <w:t>%</w:t>
+            </w:r>
+          </w:p>
+        </w:tc>
+      </w:tr>
+      <w:tr>
+        <w:tc>
+          <w:tcPr>
+            <w:tcW w:type="dxa" w:w="3600"/>
+          </w:tcPr>
+          <w:p>
+            <w:r/>
+            <w:r>
+              <w:rPr>
+                <w:sz w:val="20"/>
+              </w:rPr>
+              <w:t>Mr. Adnan Zafar</w:t>
             </w:r>
           </w:p>
         </w:tc>
@@ -1249,8 +1916,64 @@
             <w:tcW w:type="dxa" w:w="2880"/>
           </w:tcPr>
           <w:p>
+            <w:r/>
             <w:r>
-              <w:t>Responses</w:t>
+              <w:rPr>
+                <w:sz w:val="20"/>
+              </w:rPr>
+              <w:t>Computer Science</w:t>
+            </w:r>
+          </w:p>
+        </w:tc>
+        <w:tc>
+          <w:tcPr>
+            <w:tcW w:type="dxa" w:w="1728"/>
+          </w:tcPr>
+          <w:p>
+            <w:pPr>
+              <w:jc w:val="center"/>
+            </w:pPr>
+            <w:r/>
+            <w:r>
+              <w:rPr>
+                <w:sz w:val="20"/>
+              </w:rPr>
+              <w:t>13</w:t>
+            </w:r>
+          </w:p>
+        </w:tc>
+        <w:tc>
+          <w:tcPr>
+            <w:tcW w:type="dxa" w:w="1152"/>
+          </w:tcPr>
+          <w:p>
+            <w:pPr>
+              <w:jc w:val="center"/>
+            </w:pPr>
+            <w:r/>
+            <w:r>
+              <w:rPr>
+                <w:b/>
+                <w:color w:val="BF8F00"/>
+                <w:sz w:val="20"/>
+              </w:rPr>
+              <w:t>50%</w:t>
+            </w:r>
+          </w:p>
+        </w:tc>
+      </w:tr>
+      <w:tr>
+        <w:tc>
+          <w:tcPr>
+            <w:tcW w:type="dxa" w:w="3600"/>
+          </w:tcPr>
+          <w:p>
+            <w:r/>
+            <w:r>
+              <w:rPr>
+                <w:sz w:val="20"/>
+              </w:rPr>
+              <w:t>Mr. Kamran Rasheed</w:t>
             </w:r>
           </w:p>
         </w:tc>
@@ -1259,8 +1982,48 @@
             <w:tcW w:type="dxa" w:w="2880"/>
           </w:tcPr>
           <w:p>
+            <w:r/>
             <w:r>
-              <w:t>Percentage</w:t>
+              <w:rPr>
+                <w:sz w:val="20"/>
+              </w:rPr>
+              <w:t>Physics</w:t>
+            </w:r>
+          </w:p>
+        </w:tc>
+        <w:tc>
+          <w:tcPr>
+            <w:tcW w:type="dxa" w:w="1728"/>
+          </w:tcPr>
+          <w:p>
+            <w:pPr>
+              <w:jc w:val="center"/>
+            </w:pPr>
+            <w:r/>
+            <w:r>
+              <w:rPr>
+                <w:sz w:val="20"/>
+              </w:rPr>
+              <w:t>2</w:t>
+            </w:r>
+          </w:p>
+        </w:tc>
+        <w:tc>
+          <w:tcPr>
+            <w:tcW w:type="dxa" w:w="1152"/>
+          </w:tcPr>
+          <w:p>
+            <w:pPr>
+              <w:jc w:val="center"/>
+            </w:pPr>
+            <w:r/>
+            <w:r>
+              <w:rPr>
+                <w:b/>
+                <w:color w:val="BF8F00"/>
+                <w:sz w:val="20"/>
+              </w:rPr>
+              <w:t>8%</w:t>
             </w:r>
           </w:p>
         </w:tc>
@@ -1268,11 +2031,15 @@
       <w:tr>
         <w:tc>
           <w:tcPr>
-            <w:tcW w:type="dxa" w:w="2880"/>
+            <w:tcW w:type="dxa" w:w="3600"/>
           </w:tcPr>
           <w:p>
+            <w:r/>
             <w:r>
-              <w:t>Ms. Alishba Maryum - Computing</w:t>
+              <w:rPr>
+                <w:sz w:val="20"/>
+              </w:rPr>
+              <w:t>Mr. Mohsin Saleem</w:t>
             </w:r>
           </w:p>
         </w:tc>
@@ -1281,8 +2048,64 @@
             <w:tcW w:type="dxa" w:w="2880"/>
           </w:tcPr>
           <w:p>
+            <w:r/>
             <w:r>
-              <w:t>1</w:t>
+              <w:rPr>
+                <w:sz w:val="20"/>
+              </w:rPr>
+              <w:t>Chemistry</w:t>
+            </w:r>
+          </w:p>
+        </w:tc>
+        <w:tc>
+          <w:tcPr>
+            <w:tcW w:type="dxa" w:w="1728"/>
+          </w:tcPr>
+          <w:p>
+            <w:pPr>
+              <w:jc w:val="center"/>
+            </w:pPr>
+            <w:r/>
+            <w:r>
+              <w:rPr>
+                <w:sz w:val="20"/>
+              </w:rPr>
+              <w:t>2</w:t>
+            </w:r>
+          </w:p>
+        </w:tc>
+        <w:tc>
+          <w:tcPr>
+            <w:tcW w:type="dxa" w:w="1152"/>
+          </w:tcPr>
+          <w:p>
+            <w:pPr>
+              <w:jc w:val="center"/>
+            </w:pPr>
+            <w:r/>
+            <w:r>
+              <w:rPr>
+                <w:b/>
+                <w:color w:val="BF8F00"/>
+                <w:sz w:val="20"/>
+              </w:rPr>
+              <w:t>8%</w:t>
+            </w:r>
+          </w:p>
+        </w:tc>
+      </w:tr>
+      <w:tr>
+        <w:tc>
+          <w:tcPr>
+            <w:tcW w:type="dxa" w:w="3600"/>
+          </w:tcPr>
+          <w:p>
+            <w:r/>
+            <w:r>
+              <w:rPr>
+                <w:sz w:val="20"/>
+              </w:rPr>
+              <w:t>Mr. Najam Ul Hassan</w:t>
             </w:r>
           </w:p>
         </w:tc>
@@ -1291,8 +2114,48 @@
             <w:tcW w:type="dxa" w:w="2880"/>
           </w:tcPr>
           <w:p>
+            <w:r/>
             <w:r>
-              <w:t>5.0%</w:t>
+              <w:rPr>
+                <w:sz w:val="20"/>
+              </w:rPr>
+              <w:t>Math</w:t>
+            </w:r>
+          </w:p>
+        </w:tc>
+        <w:tc>
+          <w:tcPr>
+            <w:tcW w:type="dxa" w:w="1728"/>
+          </w:tcPr>
+          <w:p>
+            <w:pPr>
+              <w:jc w:val="center"/>
+            </w:pPr>
+            <w:r/>
+            <w:r>
+              <w:rPr>
+                <w:sz w:val="20"/>
+              </w:rPr>
+              <w:t>0</w:t>
+            </w:r>
+          </w:p>
+        </w:tc>
+        <w:tc>
+          <w:tcPr>
+            <w:tcW w:type="dxa" w:w="1152"/>
+          </w:tcPr>
+          <w:p>
+            <w:pPr>
+              <w:jc w:val="center"/>
+            </w:pPr>
+            <w:r/>
+            <w:r>
+              <w:rPr>
+                <w:b/>
+                <w:color w:val="BF8F00"/>
+                <w:sz w:val="20"/>
+              </w:rPr>
+              <w:t>0%</w:t>
             </w:r>
           </w:p>
         </w:tc>
@@ -1300,11 +2163,15 @@
       <w:tr>
         <w:tc>
           <w:tcPr>
-            <w:tcW w:type="dxa" w:w="2880"/>
+            <w:tcW w:type="dxa" w:w="3600"/>
           </w:tcPr>
           <w:p>
+            <w:r/>
             <w:r>
-              <w:t>Ms. Ayesha Babar - English</w:t>
+              <w:rPr>
+                <w:sz w:val="20"/>
+              </w:rPr>
+              <w:t>Ms. Bushra Abbas</w:t>
             </w:r>
           </w:p>
         </w:tc>
@@ -1313,8 +2180,64 @@
             <w:tcW w:type="dxa" w:w="2880"/>
           </w:tcPr>
           <w:p>
+            <w:r/>
             <w:r>
-              <w:t>0</w:t>
+              <w:rPr>
+                <w:sz w:val="20"/>
+              </w:rPr>
+              <w:t>English</w:t>
+            </w:r>
+          </w:p>
+        </w:tc>
+        <w:tc>
+          <w:tcPr>
+            <w:tcW w:type="dxa" w:w="1728"/>
+          </w:tcPr>
+          <w:p>
+            <w:pPr>
+              <w:jc w:val="center"/>
+            </w:pPr>
+            <w:r/>
+            <w:r>
+              <w:rPr>
+                <w:sz w:val="20"/>
+              </w:rPr>
+              <w:t>3</w:t>
+            </w:r>
+          </w:p>
+        </w:tc>
+        <w:tc>
+          <w:tcPr>
+            <w:tcW w:type="dxa" w:w="1152"/>
+          </w:tcPr>
+          <w:p>
+            <w:pPr>
+              <w:jc w:val="center"/>
+            </w:pPr>
+            <w:r/>
+            <w:r>
+              <w:rPr>
+                <w:b/>
+                <w:color w:val="BF8F00"/>
+                <w:sz w:val="20"/>
+              </w:rPr>
+              <w:t>12%</w:t>
+            </w:r>
+          </w:p>
+        </w:tc>
+      </w:tr>
+      <w:tr>
+        <w:tc>
+          <w:tcPr>
+            <w:tcW w:type="dxa" w:w="3600"/>
+          </w:tcPr>
+          <w:p>
+            <w:r/>
+            <w:r>
+              <w:rPr>
+                <w:sz w:val="20"/>
+              </w:rPr>
+              <w:t>None of the above</w:t>
             </w:r>
           </w:p>
         </w:tc>
@@ -1323,8 +2246,166 @@
             <w:tcW w:type="dxa" w:w="2880"/>
           </w:tcPr>
           <w:p>
+            <w:r/>
             <w:r>
-              <w:t>0.0%</w:t>
+              <w:rPr>
+                <w:sz w:val="20"/>
+              </w:rPr>
+              <w:t>-</w:t>
+            </w:r>
+          </w:p>
+        </w:tc>
+        <w:tc>
+          <w:tcPr>
+            <w:tcW w:type="dxa" w:w="1728"/>
+          </w:tcPr>
+          <w:p>
+            <w:pPr>
+              <w:jc w:val="center"/>
+            </w:pPr>
+            <w:r/>
+            <w:r>
+              <w:rPr>
+                <w:sz w:val="20"/>
+              </w:rPr>
+              <w:t>6</w:t>
+            </w:r>
+          </w:p>
+        </w:tc>
+        <w:tc>
+          <w:tcPr>
+            <w:tcW w:type="dxa" w:w="1152"/>
+          </w:tcPr>
+          <w:p>
+            <w:pPr>
+              <w:jc w:val="center"/>
+            </w:pPr>
+            <w:r/>
+            <w:r>
+              <w:rPr>
+                <w:b/>
+                <w:color w:val="BF8F00"/>
+                <w:sz w:val="20"/>
+              </w:rPr>
+              <w:t>23%</w:t>
+            </w:r>
+          </w:p>
+        </w:tc>
+      </w:tr>
+    </w:tbl>
+    <w:p/>
+    <w:p>
+      <w:r>
+        <w:rPr>
+          <w:b/>
+          <w:color w:val="1F3864"/>
+          <w:sz w:val="22"/>
+        </w:rPr>
+        <w:t>Q5 Which teachers use their mobile phones during class?</w:t>
+      </w:r>
+    </w:p>
+    <w:p>
+      <w:r>
+        <w:t>____________________________________________________________________________________________________</w:t>
+      </w:r>
+    </w:p>
+    <w:tbl>
+      <w:tblPr>
+        <w:tblW w:type="auto" w:w="0"/>
+        <w:tblLook w:firstColumn="1" w:firstRow="1" w:lastColumn="0" w:lastRow="0" w:noHBand="0" w:noVBand="1" w:val="04A0"/>
+        <w:tblBorders>
+          <w:top w:val="single" w:sz="10" w:color="000000"/>
+          <w:left w:val="single" w:sz="10" w:color="000000"/>
+          <w:bottom w:val="single" w:sz="10" w:color="000000"/>
+          <w:right w:val="single" w:sz="10" w:color="000000"/>
+          <w:insideH w:val="single" w:sz="10" w:color="000000"/>
+          <w:insideV w:val="single" w:sz="10" w:color="000000"/>
+        </w:tblBorders>
+      </w:tblPr>
+      <w:tblGrid>
+        <w:gridCol w:w="3600"/>
+        <w:gridCol w:w="2880"/>
+        <w:gridCol w:w="1728"/>
+        <w:gridCol w:w="1152"/>
+      </w:tblGrid>
+      <w:tr>
+        <w:tc>
+          <w:tcPr>
+            <w:tcW w:type="dxa" w:w="2160"/>
+            <w:shd w:fill="1F3864"/>
+          </w:tcPr>
+          <w:p>
+            <w:pPr>
+              <w:jc w:val="center"/>
+            </w:pPr>
+            <w:r/>
+            <w:r>
+              <w:rPr>
+                <w:b/>
+                <w:color w:val="FFFFFF"/>
+                <w:sz w:val="22"/>
+              </w:rPr>
+              <w:t>Teacher</w:t>
+            </w:r>
+          </w:p>
+        </w:tc>
+        <w:tc>
+          <w:tcPr>
+            <w:tcW w:type="dxa" w:w="2160"/>
+            <w:shd w:fill="1F3864"/>
+          </w:tcPr>
+          <w:p>
+            <w:pPr>
+              <w:jc w:val="center"/>
+            </w:pPr>
+            <w:r/>
+            <w:r>
+              <w:rPr>
+                <w:b/>
+                <w:color w:val="FFFFFF"/>
+                <w:sz w:val="22"/>
+              </w:rPr>
+              <w:t>Subject</w:t>
+            </w:r>
+          </w:p>
+        </w:tc>
+        <w:tc>
+          <w:tcPr>
+            <w:tcW w:type="dxa" w:w="2160"/>
+            <w:shd w:fill="1F3864"/>
+          </w:tcPr>
+          <w:p>
+            <w:pPr>
+              <w:jc w:val="center"/>
+            </w:pPr>
+            <w:r/>
+            <w:r>
+              <w:rPr>
+                <w:b/>
+                <w:color w:val="FFFFFF"/>
+                <w:sz w:val="22"/>
+              </w:rPr>
+              <w:t>Responses</w:t>
+            </w:r>
+          </w:p>
+        </w:tc>
+        <w:tc>
+          <w:tcPr>
+            <w:tcW w:type="dxa" w:w="2160"/>
+            <w:shd w:fill="1F3864"/>
+          </w:tcPr>
+          <w:p>
+            <w:pPr>
+              <w:jc w:val="center"/>
+            </w:pPr>
+            <w:r/>
+            <w:r>
+              <w:rPr>
+                <w:b/>
+                <w:color w:val="FFFFFF"/>
+                <w:sz w:val="22"/>
+              </w:rPr>
+              <w:t>%</w:t>
             </w:r>
           </w:p>
         </w:tc>
@@ -1332,11 +2413,15 @@
       <w:tr>
         <w:tc>
           <w:tcPr>
-            <w:tcW w:type="dxa" w:w="2880"/>
+            <w:tcW w:type="dxa" w:w="3600"/>
           </w:tcPr>
           <w:p>
+            <w:r/>
             <w:r>
-              <w:t>Ms. Kulsoom Khan - Science</w:t>
+              <w:rPr>
+                <w:sz w:val="20"/>
+              </w:rPr>
+              <w:t>Mr. Adnan Zafar</w:t>
             </w:r>
           </w:p>
         </w:tc>
@@ -1345,8 +2430,64 @@
             <w:tcW w:type="dxa" w:w="2880"/>
           </w:tcPr>
           <w:p>
+            <w:r/>
             <w:r>
+              <w:rPr>
+                <w:sz w:val="20"/>
+              </w:rPr>
+              <w:t>Computer Science</w:t>
+            </w:r>
+          </w:p>
+        </w:tc>
+        <w:tc>
+          <w:tcPr>
+            <w:tcW w:type="dxa" w:w="1728"/>
+          </w:tcPr>
+          <w:p>
+            <w:pPr>
+              <w:jc w:val="center"/>
+            </w:pPr>
+            <w:r/>
+            <w:r>
+              <w:rPr>
+                <w:sz w:val="20"/>
+              </w:rPr>
               <w:t>0</w:t>
+            </w:r>
+          </w:p>
+        </w:tc>
+        <w:tc>
+          <w:tcPr>
+            <w:tcW w:type="dxa" w:w="1152"/>
+          </w:tcPr>
+          <w:p>
+            <w:pPr>
+              <w:jc w:val="center"/>
+            </w:pPr>
+            <w:r/>
+            <w:r>
+              <w:rPr>
+                <w:b/>
+                <w:color w:val="BF8F00"/>
+                <w:sz w:val="20"/>
+              </w:rPr>
+              <w:t>0%</w:t>
+            </w:r>
+          </w:p>
+        </w:tc>
+      </w:tr>
+      <w:tr>
+        <w:tc>
+          <w:tcPr>
+            <w:tcW w:type="dxa" w:w="3600"/>
+          </w:tcPr>
+          <w:p>
+            <w:r/>
+            <w:r>
+              <w:rPr>
+                <w:sz w:val="20"/>
+              </w:rPr>
+              <w:t>Mr. Kamran Rasheed</w:t>
             </w:r>
           </w:p>
         </w:tc>
@@ -1355,8 +2496,48 @@
             <w:tcW w:type="dxa" w:w="2880"/>
           </w:tcPr>
           <w:p>
+            <w:r/>
             <w:r>
-              <w:t>0.0%</w:t>
+              <w:rPr>
+                <w:sz w:val="20"/>
+              </w:rPr>
+              <w:t>Physics</w:t>
+            </w:r>
+          </w:p>
+        </w:tc>
+        <w:tc>
+          <w:tcPr>
+            <w:tcW w:type="dxa" w:w="1728"/>
+          </w:tcPr>
+          <w:p>
+            <w:pPr>
+              <w:jc w:val="center"/>
+            </w:pPr>
+            <w:r/>
+            <w:r>
+              <w:rPr>
+                <w:sz w:val="20"/>
+              </w:rPr>
+              <w:t>6</w:t>
+            </w:r>
+          </w:p>
+        </w:tc>
+        <w:tc>
+          <w:tcPr>
+            <w:tcW w:type="dxa" w:w="1152"/>
+          </w:tcPr>
+          <w:p>
+            <w:pPr>
+              <w:jc w:val="center"/>
+            </w:pPr>
+            <w:r/>
+            <w:r>
+              <w:rPr>
+                <w:b/>
+                <w:color w:val="BF8F00"/>
+                <w:sz w:val="20"/>
+              </w:rPr>
+              <w:t>23%</w:t>
             </w:r>
           </w:p>
         </w:tc>
@@ -1364,11 +2545,15 @@
       <w:tr>
         <w:tc>
           <w:tcPr>
-            <w:tcW w:type="dxa" w:w="2880"/>
+            <w:tcW w:type="dxa" w:w="3600"/>
           </w:tcPr>
           <w:p>
+            <w:r/>
             <w:r>
-              <w:t>Ms. Maria Yaqoob - GP</w:t>
+              <w:rPr>
+                <w:sz w:val="20"/>
+              </w:rPr>
+              <w:t>Mr. Mohsin Saleem</w:t>
             </w:r>
           </w:p>
         </w:tc>
@@ -1377,8 +2562,64 @@
             <w:tcW w:type="dxa" w:w="2880"/>
           </w:tcPr>
           <w:p>
+            <w:r/>
             <w:r>
+              <w:rPr>
+                <w:sz w:val="20"/>
+              </w:rPr>
+              <w:t>Chemistry</w:t>
+            </w:r>
+          </w:p>
+        </w:tc>
+        <w:tc>
+          <w:tcPr>
+            <w:tcW w:type="dxa" w:w="1728"/>
+          </w:tcPr>
+          <w:p>
+            <w:pPr>
+              <w:jc w:val="center"/>
+            </w:pPr>
+            <w:r/>
+            <w:r>
+              <w:rPr>
+                <w:sz w:val="20"/>
+              </w:rPr>
               <w:t>0</w:t>
+            </w:r>
+          </w:p>
+        </w:tc>
+        <w:tc>
+          <w:tcPr>
+            <w:tcW w:type="dxa" w:w="1152"/>
+          </w:tcPr>
+          <w:p>
+            <w:pPr>
+              <w:jc w:val="center"/>
+            </w:pPr>
+            <w:r/>
+            <w:r>
+              <w:rPr>
+                <w:b/>
+                <w:color w:val="BF8F00"/>
+                <w:sz w:val="20"/>
+              </w:rPr>
+              <w:t>0%</w:t>
+            </w:r>
+          </w:p>
+        </w:tc>
+      </w:tr>
+      <w:tr>
+        <w:tc>
+          <w:tcPr>
+            <w:tcW w:type="dxa" w:w="3600"/>
+          </w:tcPr>
+          <w:p>
+            <w:r/>
+            <w:r>
+              <w:rPr>
+                <w:sz w:val="20"/>
+              </w:rPr>
+              <w:t>Mr. Najam Ul Hassan</w:t>
             </w:r>
           </w:p>
         </w:tc>
@@ -1387,8 +2628,48 @@
             <w:tcW w:type="dxa" w:w="2880"/>
           </w:tcPr>
           <w:p>
+            <w:r/>
             <w:r>
-              <w:t>0.0%</w:t>
+              <w:rPr>
+                <w:sz w:val="20"/>
+              </w:rPr>
+              <w:t>Math</w:t>
+            </w:r>
+          </w:p>
+        </w:tc>
+        <w:tc>
+          <w:tcPr>
+            <w:tcW w:type="dxa" w:w="1728"/>
+          </w:tcPr>
+          <w:p>
+            <w:pPr>
+              <w:jc w:val="center"/>
+            </w:pPr>
+            <w:r/>
+            <w:r>
+              <w:rPr>
+                <w:sz w:val="20"/>
+              </w:rPr>
+              <w:t>0</w:t>
+            </w:r>
+          </w:p>
+        </w:tc>
+        <w:tc>
+          <w:tcPr>
+            <w:tcW w:type="dxa" w:w="1152"/>
+          </w:tcPr>
+          <w:p>
+            <w:pPr>
+              <w:jc w:val="center"/>
+            </w:pPr>
+            <w:r/>
+            <w:r>
+              <w:rPr>
+                <w:b/>
+                <w:color w:val="BF8F00"/>
+                <w:sz w:val="20"/>
+              </w:rPr>
+              <w:t>0%</w:t>
             </w:r>
           </w:p>
         </w:tc>
@@ -1396,11 +2677,15 @@
       <w:tr>
         <w:tc>
           <w:tcPr>
-            <w:tcW w:type="dxa" w:w="2880"/>
+            <w:tcW w:type="dxa" w:w="3600"/>
           </w:tcPr>
           <w:p>
+            <w:r/>
             <w:r>
-              <w:t>Ms. Raiha Batool - Maths</w:t>
+              <w:rPr>
+                <w:sz w:val="20"/>
+              </w:rPr>
+              <w:t>Ms. Bushra Abbas</w:t>
             </w:r>
           </w:p>
         </w:tc>
@@ -1409,8 +2694,64 @@
             <w:tcW w:type="dxa" w:w="2880"/>
           </w:tcPr>
           <w:p>
+            <w:r/>
             <w:r>
-              <w:t>1</w:t>
+              <w:rPr>
+                <w:sz w:val="20"/>
+              </w:rPr>
+              <w:t>English</w:t>
+            </w:r>
+          </w:p>
+        </w:tc>
+        <w:tc>
+          <w:tcPr>
+            <w:tcW w:type="dxa" w:w="1728"/>
+          </w:tcPr>
+          <w:p>
+            <w:pPr>
+              <w:jc w:val="center"/>
+            </w:pPr>
+            <w:r/>
+            <w:r>
+              <w:rPr>
+                <w:sz w:val="20"/>
+              </w:rPr>
+              <w:t>2</w:t>
+            </w:r>
+          </w:p>
+        </w:tc>
+        <w:tc>
+          <w:tcPr>
+            <w:tcW w:type="dxa" w:w="1152"/>
+          </w:tcPr>
+          <w:p>
+            <w:pPr>
+              <w:jc w:val="center"/>
+            </w:pPr>
+            <w:r/>
+            <w:r>
+              <w:rPr>
+                <w:b/>
+                <w:color w:val="BF8F00"/>
+                <w:sz w:val="20"/>
+              </w:rPr>
+              <w:t>8%</w:t>
+            </w:r>
+          </w:p>
+        </w:tc>
+      </w:tr>
+      <w:tr>
+        <w:tc>
+          <w:tcPr>
+            <w:tcW w:type="dxa" w:w="3600"/>
+          </w:tcPr>
+          <w:p>
+            <w:r/>
+            <w:r>
+              <w:rPr>
+                <w:sz w:val="20"/>
+              </w:rPr>
+              <w:t>None of the above</w:t>
             </w:r>
           </w:p>
         </w:tc>
@@ -1419,8 +2760,166 @@
             <w:tcW w:type="dxa" w:w="2880"/>
           </w:tcPr>
           <w:p>
+            <w:r/>
             <w:r>
-              <w:t>5.0%</w:t>
+              <w:rPr>
+                <w:sz w:val="20"/>
+              </w:rPr>
+              <w:t>-</w:t>
+            </w:r>
+          </w:p>
+        </w:tc>
+        <w:tc>
+          <w:tcPr>
+            <w:tcW w:type="dxa" w:w="1728"/>
+          </w:tcPr>
+          <w:p>
+            <w:pPr>
+              <w:jc w:val="center"/>
+            </w:pPr>
+            <w:r/>
+            <w:r>
+              <w:rPr>
+                <w:sz w:val="20"/>
+              </w:rPr>
+              <w:t>13</w:t>
+            </w:r>
+          </w:p>
+        </w:tc>
+        <w:tc>
+          <w:tcPr>
+            <w:tcW w:type="dxa" w:w="1152"/>
+          </w:tcPr>
+          <w:p>
+            <w:pPr>
+              <w:jc w:val="center"/>
+            </w:pPr>
+            <w:r/>
+            <w:r>
+              <w:rPr>
+                <w:b/>
+                <w:color w:val="BF8F00"/>
+                <w:sz w:val="20"/>
+              </w:rPr>
+              <w:t>50%</w:t>
+            </w:r>
+          </w:p>
+        </w:tc>
+      </w:tr>
+    </w:tbl>
+    <w:p/>
+    <w:p>
+      <w:r>
+        <w:rPr>
+          <w:b/>
+          <w:color w:val="1F3864"/>
+          <w:sz w:val="22"/>
+        </w:rPr>
+        <w:t>Q6 Has any teacher asked you to take paid tuition from him/her in the evening to get good grade?</w:t>
+      </w:r>
+    </w:p>
+    <w:p>
+      <w:r>
+        <w:t>____________________________________________________________________________________________________</w:t>
+      </w:r>
+    </w:p>
+    <w:tbl>
+      <w:tblPr>
+        <w:tblW w:type="auto" w:w="0"/>
+        <w:tblLook w:firstColumn="1" w:firstRow="1" w:lastColumn="0" w:lastRow="0" w:noHBand="0" w:noVBand="1" w:val="04A0"/>
+        <w:tblBorders>
+          <w:top w:val="single" w:sz="10" w:color="000000"/>
+          <w:left w:val="single" w:sz="10" w:color="000000"/>
+          <w:bottom w:val="single" w:sz="10" w:color="000000"/>
+          <w:right w:val="single" w:sz="10" w:color="000000"/>
+          <w:insideH w:val="single" w:sz="10" w:color="000000"/>
+          <w:insideV w:val="single" w:sz="10" w:color="000000"/>
+        </w:tblBorders>
+      </w:tblPr>
+      <w:tblGrid>
+        <w:gridCol w:w="3600"/>
+        <w:gridCol w:w="2880"/>
+        <w:gridCol w:w="1728"/>
+        <w:gridCol w:w="1152"/>
+      </w:tblGrid>
+      <w:tr>
+        <w:tc>
+          <w:tcPr>
+            <w:tcW w:type="dxa" w:w="2160"/>
+            <w:shd w:fill="1F3864"/>
+          </w:tcPr>
+          <w:p>
+            <w:pPr>
+              <w:jc w:val="center"/>
+            </w:pPr>
+            <w:r/>
+            <w:r>
+              <w:rPr>
+                <w:b/>
+                <w:color w:val="FFFFFF"/>
+                <w:sz w:val="22"/>
+              </w:rPr>
+              <w:t>Teacher</w:t>
+            </w:r>
+          </w:p>
+        </w:tc>
+        <w:tc>
+          <w:tcPr>
+            <w:tcW w:type="dxa" w:w="2160"/>
+            <w:shd w:fill="1F3864"/>
+          </w:tcPr>
+          <w:p>
+            <w:pPr>
+              <w:jc w:val="center"/>
+            </w:pPr>
+            <w:r/>
+            <w:r>
+              <w:rPr>
+                <w:b/>
+                <w:color w:val="FFFFFF"/>
+                <w:sz w:val="22"/>
+              </w:rPr>
+              <w:t>Subject</w:t>
+            </w:r>
+          </w:p>
+        </w:tc>
+        <w:tc>
+          <w:tcPr>
+            <w:tcW w:type="dxa" w:w="2160"/>
+            <w:shd w:fill="1F3864"/>
+          </w:tcPr>
+          <w:p>
+            <w:pPr>
+              <w:jc w:val="center"/>
+            </w:pPr>
+            <w:r/>
+            <w:r>
+              <w:rPr>
+                <w:b/>
+                <w:color w:val="FFFFFF"/>
+                <w:sz w:val="22"/>
+              </w:rPr>
+              <w:t>Responses</w:t>
+            </w:r>
+          </w:p>
+        </w:tc>
+        <w:tc>
+          <w:tcPr>
+            <w:tcW w:type="dxa" w:w="2160"/>
+            <w:shd w:fill="1F3864"/>
+          </w:tcPr>
+          <w:p>
+            <w:pPr>
+              <w:jc w:val="center"/>
+            </w:pPr>
+            <w:r/>
+            <w:r>
+              <w:rPr>
+                <w:b/>
+                <w:color w:val="FFFFFF"/>
+                <w:sz w:val="22"/>
+              </w:rPr>
+              <w:t>%</w:t>
             </w:r>
           </w:p>
         </w:tc>
@@ -1428,11 +2927,15 @@
       <w:tr>
         <w:tc>
           <w:tcPr>
-            <w:tcW w:type="dxa" w:w="2880"/>
+            <w:tcW w:type="dxa" w:w="3600"/>
           </w:tcPr>
           <w:p>
+            <w:r/>
             <w:r>
-              <w:t>Ms. Samira Naveed - Urdu</w:t>
+              <w:rPr>
+                <w:sz w:val="20"/>
+              </w:rPr>
+              <w:t>Mr. Adnan Zafar</w:t>
             </w:r>
           </w:p>
         </w:tc>
@@ -1441,8 +2944,64 @@
             <w:tcW w:type="dxa" w:w="2880"/>
           </w:tcPr>
           <w:p>
+            <w:r/>
             <w:r>
-              <w:t>2</w:t>
+              <w:rPr>
+                <w:sz w:val="20"/>
+              </w:rPr>
+              <w:t>Computer Science</w:t>
+            </w:r>
+          </w:p>
+        </w:tc>
+        <w:tc>
+          <w:tcPr>
+            <w:tcW w:type="dxa" w:w="1728"/>
+          </w:tcPr>
+          <w:p>
+            <w:pPr>
+              <w:jc w:val="center"/>
+            </w:pPr>
+            <w:r/>
+            <w:r>
+              <w:rPr>
+                <w:sz w:val="20"/>
+              </w:rPr>
+              <w:t>0</w:t>
+            </w:r>
+          </w:p>
+        </w:tc>
+        <w:tc>
+          <w:tcPr>
+            <w:tcW w:type="dxa" w:w="1152"/>
+          </w:tcPr>
+          <w:p>
+            <w:pPr>
+              <w:jc w:val="center"/>
+            </w:pPr>
+            <w:r/>
+            <w:r>
+              <w:rPr>
+                <w:b/>
+                <w:color w:val="BF8F00"/>
+                <w:sz w:val="20"/>
+              </w:rPr>
+              <w:t>0%</w:t>
+            </w:r>
+          </w:p>
+        </w:tc>
+      </w:tr>
+      <w:tr>
+        <w:tc>
+          <w:tcPr>
+            <w:tcW w:type="dxa" w:w="3600"/>
+          </w:tcPr>
+          <w:p>
+            <w:r/>
+            <w:r>
+              <w:rPr>
+                <w:sz w:val="20"/>
+              </w:rPr>
+              <w:t>Mr. Kamran Rasheed</w:t>
             </w:r>
           </w:p>
         </w:tc>
@@ -1451,8 +3010,48 @@
             <w:tcW w:type="dxa" w:w="2880"/>
           </w:tcPr>
           <w:p>
+            <w:r/>
             <w:r>
-              <w:t>10.0%</w:t>
+              <w:rPr>
+                <w:sz w:val="20"/>
+              </w:rPr>
+              <w:t>Physics</w:t>
+            </w:r>
+          </w:p>
+        </w:tc>
+        <w:tc>
+          <w:tcPr>
+            <w:tcW w:type="dxa" w:w="1728"/>
+          </w:tcPr>
+          <w:p>
+            <w:pPr>
+              <w:jc w:val="center"/>
+            </w:pPr>
+            <w:r/>
+            <w:r>
+              <w:rPr>
+                <w:sz w:val="20"/>
+              </w:rPr>
+              <w:t>0</w:t>
+            </w:r>
+          </w:p>
+        </w:tc>
+        <w:tc>
+          <w:tcPr>
+            <w:tcW w:type="dxa" w:w="1152"/>
+          </w:tcPr>
+          <w:p>
+            <w:pPr>
+              <w:jc w:val="center"/>
+            </w:pPr>
+            <w:r/>
+            <w:r>
+              <w:rPr>
+                <w:b/>
+                <w:color w:val="BF8F00"/>
+                <w:sz w:val="20"/>
+              </w:rPr>
+              <w:t>0%</w:t>
             </w:r>
           </w:p>
         </w:tc>
@@ -1460,11 +3059,15 @@
       <w:tr>
         <w:tc>
           <w:tcPr>
-            <w:tcW w:type="dxa" w:w="2880"/>
+            <w:tcW w:type="dxa" w:w="3600"/>
           </w:tcPr>
           <w:p>
+            <w:r/>
             <w:r>
-              <w:t>Ms. Summia Naz - Islamiat</w:t>
+              <w:rPr>
+                <w:sz w:val="20"/>
+              </w:rPr>
+              <w:t>Mr. Mohsin Saleem</w:t>
             </w:r>
           </w:p>
         </w:tc>
@@ -1473,8 +3076,64 @@
             <w:tcW w:type="dxa" w:w="2880"/>
           </w:tcPr>
           <w:p>
+            <w:r/>
             <w:r>
-              <w:t>1</w:t>
+              <w:rPr>
+                <w:sz w:val="20"/>
+              </w:rPr>
+              <w:t>Chemistry</w:t>
+            </w:r>
+          </w:p>
+        </w:tc>
+        <w:tc>
+          <w:tcPr>
+            <w:tcW w:type="dxa" w:w="1728"/>
+          </w:tcPr>
+          <w:p>
+            <w:pPr>
+              <w:jc w:val="center"/>
+            </w:pPr>
+            <w:r/>
+            <w:r>
+              <w:rPr>
+                <w:sz w:val="20"/>
+              </w:rPr>
+              <w:t>2</w:t>
+            </w:r>
+          </w:p>
+        </w:tc>
+        <w:tc>
+          <w:tcPr>
+            <w:tcW w:type="dxa" w:w="1152"/>
+          </w:tcPr>
+          <w:p>
+            <w:pPr>
+              <w:jc w:val="center"/>
+            </w:pPr>
+            <w:r/>
+            <w:r>
+              <w:rPr>
+                <w:b/>
+                <w:color w:val="BF8F00"/>
+                <w:sz w:val="20"/>
+              </w:rPr>
+              <w:t>8%</w:t>
+            </w:r>
+          </w:p>
+        </w:tc>
+      </w:tr>
+      <w:tr>
+        <w:tc>
+          <w:tcPr>
+            <w:tcW w:type="dxa" w:w="3600"/>
+          </w:tcPr>
+          <w:p>
+            <w:r/>
+            <w:r>
+              <w:rPr>
+                <w:sz w:val="20"/>
+              </w:rPr>
+              <w:t>Mr. Najam Ul Hassan</w:t>
             </w:r>
           </w:p>
         </w:tc>
@@ -1483,8 +3142,48 @@
             <w:tcW w:type="dxa" w:w="2880"/>
           </w:tcPr>
           <w:p>
+            <w:r/>
             <w:r>
-              <w:t>5.0%</w:t>
+              <w:rPr>
+                <w:sz w:val="20"/>
+              </w:rPr>
+              <w:t>Math</w:t>
+            </w:r>
+          </w:p>
+        </w:tc>
+        <w:tc>
+          <w:tcPr>
+            <w:tcW w:type="dxa" w:w="1728"/>
+          </w:tcPr>
+          <w:p>
+            <w:pPr>
+              <w:jc w:val="center"/>
+            </w:pPr>
+            <w:r/>
+            <w:r>
+              <w:rPr>
+                <w:sz w:val="20"/>
+              </w:rPr>
+              <w:t>0</w:t>
+            </w:r>
+          </w:p>
+        </w:tc>
+        <w:tc>
+          <w:tcPr>
+            <w:tcW w:type="dxa" w:w="1152"/>
+          </w:tcPr>
+          <w:p>
+            <w:pPr>
+              <w:jc w:val="center"/>
+            </w:pPr>
+            <w:r/>
+            <w:r>
+              <w:rPr>
+                <w:b/>
+                <w:color w:val="BF8F00"/>
+                <w:sz w:val="20"/>
+              </w:rPr>
+              <w:t>0%</w:t>
             </w:r>
           </w:p>
         </w:tc>
@@ -1492,11 +3191,15 @@
       <w:tr>
         <w:tc>
           <w:tcPr>
-            <w:tcW w:type="dxa" w:w="2880"/>
+            <w:tcW w:type="dxa" w:w="3600"/>
           </w:tcPr>
           <w:p>
+            <w:r/>
             <w:r>
-              <w:t>No One</w:t>
+              <w:rPr>
+                <w:sz w:val="20"/>
+              </w:rPr>
+              <w:t>Ms. Bushra Abbas</w:t>
             </w:r>
           </w:p>
         </w:tc>
@@ -1505,8 +3208,64 @@
             <w:tcW w:type="dxa" w:w="2880"/>
           </w:tcPr>
           <w:p>
+            <w:r/>
             <w:r>
-              <w:t>15</w:t>
+              <w:rPr>
+                <w:sz w:val="20"/>
+              </w:rPr>
+              <w:t>English</w:t>
+            </w:r>
+          </w:p>
+        </w:tc>
+        <w:tc>
+          <w:tcPr>
+            <w:tcW w:type="dxa" w:w="1728"/>
+          </w:tcPr>
+          <w:p>
+            <w:pPr>
+              <w:jc w:val="center"/>
+            </w:pPr>
+            <w:r/>
+            <w:r>
+              <w:rPr>
+                <w:sz w:val="20"/>
+              </w:rPr>
+              <w:t>0</w:t>
+            </w:r>
+          </w:p>
+        </w:tc>
+        <w:tc>
+          <w:tcPr>
+            <w:tcW w:type="dxa" w:w="1152"/>
+          </w:tcPr>
+          <w:p>
+            <w:pPr>
+              <w:jc w:val="center"/>
+            </w:pPr>
+            <w:r/>
+            <w:r>
+              <w:rPr>
+                <w:b/>
+                <w:color w:val="BF8F00"/>
+                <w:sz w:val="20"/>
+              </w:rPr>
+              <w:t>0%</w:t>
+            </w:r>
+          </w:p>
+        </w:tc>
+      </w:tr>
+      <w:tr>
+        <w:tc>
+          <w:tcPr>
+            <w:tcW w:type="dxa" w:w="3600"/>
+          </w:tcPr>
+          <w:p>
+            <w:r/>
+            <w:r>
+              <w:rPr>
+                <w:sz w:val="20"/>
+              </w:rPr>
+              <w:t>None of the above</w:t>
             </w:r>
           </w:p>
         </w:tc>
@@ -1515,18 +3274,568 @@
             <w:tcW w:type="dxa" w:w="2880"/>
           </w:tcPr>
           <w:p>
+            <w:r/>
             <w:r>
-              <w:t>75.0%</w:t>
+              <w:rPr>
+                <w:sz w:val="20"/>
+              </w:rPr>
+              <w:t>-</w:t>
+            </w:r>
+          </w:p>
+        </w:tc>
+        <w:tc>
+          <w:tcPr>
+            <w:tcW w:type="dxa" w:w="1728"/>
+          </w:tcPr>
+          <w:p>
+            <w:pPr>
+              <w:jc w:val="center"/>
+            </w:pPr>
+            <w:r/>
+            <w:r>
+              <w:rPr>
+                <w:sz w:val="20"/>
+              </w:rPr>
+              <w:t>19</w:t>
+            </w:r>
+          </w:p>
+        </w:tc>
+        <w:tc>
+          <w:tcPr>
+            <w:tcW w:type="dxa" w:w="1152"/>
+          </w:tcPr>
+          <w:p>
+            <w:pPr>
+              <w:jc w:val="center"/>
+            </w:pPr>
+            <w:r/>
+            <w:r>
+              <w:rPr>
+                <w:b/>
+                <w:color w:val="BF8F00"/>
+                <w:sz w:val="20"/>
+              </w:rPr>
+              <w:t>73%</w:t>
             </w:r>
           </w:p>
         </w:tc>
       </w:tr>
     </w:tbl>
+    <w:p/>
     <w:p>
       <w:r>
-        <w:br w:type="page"/>
+        <w:rPr>
+          <w:b/>
+          <w:color w:val="1F3864"/>
+          <w:sz w:val="22"/>
+        </w:rPr>
+        <w:t>Q7 Which subject do you find the most difficult?</w:t>
       </w:r>
     </w:p>
+    <w:p>
+      <w:r>
+        <w:t>____________________________________________________________________________________________________</w:t>
+      </w:r>
+    </w:p>
+    <w:tbl>
+      <w:tblPr>
+        <w:tblW w:type="auto" w:w="0"/>
+        <w:tblLook w:firstColumn="1" w:firstRow="1" w:lastColumn="0" w:lastRow="0" w:noHBand="0" w:noVBand="1" w:val="04A0"/>
+        <w:tblBorders>
+          <w:top w:val="single" w:sz="10" w:color="000000"/>
+          <w:left w:val="single" w:sz="10" w:color="000000"/>
+          <w:bottom w:val="single" w:sz="10" w:color="000000"/>
+          <w:right w:val="single" w:sz="10" w:color="000000"/>
+          <w:insideH w:val="single" w:sz="10" w:color="000000"/>
+          <w:insideV w:val="single" w:sz="10" w:color="000000"/>
+        </w:tblBorders>
+      </w:tblPr>
+      <w:tblGrid>
+        <w:gridCol w:w="3600"/>
+        <w:gridCol w:w="2880"/>
+        <w:gridCol w:w="1728"/>
+        <w:gridCol w:w="1152"/>
+      </w:tblGrid>
+      <w:tr>
+        <w:tc>
+          <w:tcPr>
+            <w:tcW w:type="dxa" w:w="2160"/>
+            <w:shd w:fill="1F3864"/>
+          </w:tcPr>
+          <w:p>
+            <w:pPr>
+              <w:jc w:val="center"/>
+            </w:pPr>
+            <w:r/>
+            <w:r>
+              <w:rPr>
+                <w:b/>
+                <w:color w:val="FFFFFF"/>
+                <w:sz w:val="22"/>
+              </w:rPr>
+              <w:t>Teacher</w:t>
+            </w:r>
+          </w:p>
+        </w:tc>
+        <w:tc>
+          <w:tcPr>
+            <w:tcW w:type="dxa" w:w="2160"/>
+            <w:shd w:fill="1F3864"/>
+          </w:tcPr>
+          <w:p>
+            <w:pPr>
+              <w:jc w:val="center"/>
+            </w:pPr>
+            <w:r/>
+            <w:r>
+              <w:rPr>
+                <w:b/>
+                <w:color w:val="FFFFFF"/>
+                <w:sz w:val="22"/>
+              </w:rPr>
+              <w:t>Subject</w:t>
+            </w:r>
+          </w:p>
+        </w:tc>
+        <w:tc>
+          <w:tcPr>
+            <w:tcW w:type="dxa" w:w="2160"/>
+            <w:shd w:fill="1F3864"/>
+          </w:tcPr>
+          <w:p>
+            <w:pPr>
+              <w:jc w:val="center"/>
+            </w:pPr>
+            <w:r/>
+            <w:r>
+              <w:rPr>
+                <w:b/>
+                <w:color w:val="FFFFFF"/>
+                <w:sz w:val="22"/>
+              </w:rPr>
+              <w:t>Responses</w:t>
+            </w:r>
+          </w:p>
+        </w:tc>
+        <w:tc>
+          <w:tcPr>
+            <w:tcW w:type="dxa" w:w="2160"/>
+            <w:shd w:fill="1F3864"/>
+          </w:tcPr>
+          <w:p>
+            <w:pPr>
+              <w:jc w:val="center"/>
+            </w:pPr>
+            <w:r/>
+            <w:r>
+              <w:rPr>
+                <w:b/>
+                <w:color w:val="FFFFFF"/>
+                <w:sz w:val="22"/>
+              </w:rPr>
+              <w:t>%</w:t>
+            </w:r>
+          </w:p>
+        </w:tc>
+      </w:tr>
+      <w:tr>
+        <w:tc>
+          <w:tcPr>
+            <w:tcW w:type="dxa" w:w="3600"/>
+          </w:tcPr>
+          <w:p>
+            <w:r/>
+            <w:r>
+              <w:rPr>
+                <w:sz w:val="20"/>
+              </w:rPr>
+              <w:t>Mr. Adnan Zafar</w:t>
+            </w:r>
+          </w:p>
+        </w:tc>
+        <w:tc>
+          <w:tcPr>
+            <w:tcW w:type="dxa" w:w="2880"/>
+          </w:tcPr>
+          <w:p>
+            <w:r/>
+            <w:r>
+              <w:rPr>
+                <w:sz w:val="20"/>
+              </w:rPr>
+              <w:t>Computer Science</w:t>
+            </w:r>
+          </w:p>
+        </w:tc>
+        <w:tc>
+          <w:tcPr>
+            <w:tcW w:type="dxa" w:w="1728"/>
+          </w:tcPr>
+          <w:p>
+            <w:pPr>
+              <w:jc w:val="center"/>
+            </w:pPr>
+            <w:r/>
+            <w:r>
+              <w:rPr>
+                <w:sz w:val="20"/>
+              </w:rPr>
+              <w:t>2</w:t>
+            </w:r>
+          </w:p>
+        </w:tc>
+        <w:tc>
+          <w:tcPr>
+            <w:tcW w:type="dxa" w:w="1152"/>
+          </w:tcPr>
+          <w:p>
+            <w:pPr>
+              <w:jc w:val="center"/>
+            </w:pPr>
+            <w:r/>
+            <w:r>
+              <w:rPr>
+                <w:b/>
+                <w:color w:val="BF8F00"/>
+                <w:sz w:val="20"/>
+              </w:rPr>
+              <w:t>8%</w:t>
+            </w:r>
+          </w:p>
+        </w:tc>
+      </w:tr>
+      <w:tr>
+        <w:tc>
+          <w:tcPr>
+            <w:tcW w:type="dxa" w:w="3600"/>
+          </w:tcPr>
+          <w:p>
+            <w:r/>
+            <w:r>
+              <w:rPr>
+                <w:sz w:val="20"/>
+              </w:rPr>
+              <w:t>Mr. Kamran Rasheed</w:t>
+            </w:r>
+          </w:p>
+        </w:tc>
+        <w:tc>
+          <w:tcPr>
+            <w:tcW w:type="dxa" w:w="2880"/>
+          </w:tcPr>
+          <w:p>
+            <w:r/>
+            <w:r>
+              <w:rPr>
+                <w:sz w:val="20"/>
+              </w:rPr>
+              <w:t>Physics</w:t>
+            </w:r>
+          </w:p>
+        </w:tc>
+        <w:tc>
+          <w:tcPr>
+            <w:tcW w:type="dxa" w:w="1728"/>
+          </w:tcPr>
+          <w:p>
+            <w:pPr>
+              <w:jc w:val="center"/>
+            </w:pPr>
+            <w:r/>
+            <w:r>
+              <w:rPr>
+                <w:sz w:val="20"/>
+              </w:rPr>
+              <w:t>8</w:t>
+            </w:r>
+          </w:p>
+        </w:tc>
+        <w:tc>
+          <w:tcPr>
+            <w:tcW w:type="dxa" w:w="1152"/>
+          </w:tcPr>
+          <w:p>
+            <w:pPr>
+              <w:jc w:val="center"/>
+            </w:pPr>
+            <w:r/>
+            <w:r>
+              <w:rPr>
+                <w:b/>
+                <w:color w:val="BF8F00"/>
+                <w:sz w:val="20"/>
+              </w:rPr>
+              <w:t>31%</w:t>
+            </w:r>
+          </w:p>
+        </w:tc>
+      </w:tr>
+      <w:tr>
+        <w:tc>
+          <w:tcPr>
+            <w:tcW w:type="dxa" w:w="3600"/>
+          </w:tcPr>
+          <w:p>
+            <w:r/>
+            <w:r>
+              <w:rPr>
+                <w:sz w:val="20"/>
+              </w:rPr>
+              <w:t>Mr. Mohsin Saleem</w:t>
+            </w:r>
+          </w:p>
+        </w:tc>
+        <w:tc>
+          <w:tcPr>
+            <w:tcW w:type="dxa" w:w="2880"/>
+          </w:tcPr>
+          <w:p>
+            <w:r/>
+            <w:r>
+              <w:rPr>
+                <w:sz w:val="20"/>
+              </w:rPr>
+              <w:t>Chemistry</w:t>
+            </w:r>
+          </w:p>
+        </w:tc>
+        <w:tc>
+          <w:tcPr>
+            <w:tcW w:type="dxa" w:w="1728"/>
+          </w:tcPr>
+          <w:p>
+            <w:pPr>
+              <w:jc w:val="center"/>
+            </w:pPr>
+            <w:r/>
+            <w:r>
+              <w:rPr>
+                <w:sz w:val="20"/>
+              </w:rPr>
+              <w:t>13</w:t>
+            </w:r>
+          </w:p>
+        </w:tc>
+        <w:tc>
+          <w:tcPr>
+            <w:tcW w:type="dxa" w:w="1152"/>
+          </w:tcPr>
+          <w:p>
+            <w:pPr>
+              <w:jc w:val="center"/>
+            </w:pPr>
+            <w:r/>
+            <w:r>
+              <w:rPr>
+                <w:b/>
+                <w:color w:val="BF8F00"/>
+                <w:sz w:val="20"/>
+              </w:rPr>
+              <w:t>50%</w:t>
+            </w:r>
+          </w:p>
+        </w:tc>
+      </w:tr>
+      <w:tr>
+        <w:tc>
+          <w:tcPr>
+            <w:tcW w:type="dxa" w:w="3600"/>
+          </w:tcPr>
+          <w:p>
+            <w:r/>
+            <w:r>
+              <w:rPr>
+                <w:sz w:val="20"/>
+              </w:rPr>
+              <w:t>Mr. Najam Ul Hassan</w:t>
+            </w:r>
+          </w:p>
+        </w:tc>
+        <w:tc>
+          <w:tcPr>
+            <w:tcW w:type="dxa" w:w="2880"/>
+          </w:tcPr>
+          <w:p>
+            <w:r/>
+            <w:r>
+              <w:rPr>
+                <w:sz w:val="20"/>
+              </w:rPr>
+              <w:t>Math</w:t>
+            </w:r>
+          </w:p>
+        </w:tc>
+        <w:tc>
+          <w:tcPr>
+            <w:tcW w:type="dxa" w:w="1728"/>
+          </w:tcPr>
+          <w:p>
+            <w:pPr>
+              <w:jc w:val="center"/>
+            </w:pPr>
+            <w:r/>
+            <w:r>
+              <w:rPr>
+                <w:sz w:val="20"/>
+              </w:rPr>
+              <w:t>3</w:t>
+            </w:r>
+          </w:p>
+        </w:tc>
+        <w:tc>
+          <w:tcPr>
+            <w:tcW w:type="dxa" w:w="1152"/>
+          </w:tcPr>
+          <w:p>
+            <w:pPr>
+              <w:jc w:val="center"/>
+            </w:pPr>
+            <w:r/>
+            <w:r>
+              <w:rPr>
+                <w:b/>
+                <w:color w:val="BF8F00"/>
+                <w:sz w:val="20"/>
+              </w:rPr>
+              <w:t>12%</w:t>
+            </w:r>
+          </w:p>
+        </w:tc>
+      </w:tr>
+      <w:tr>
+        <w:tc>
+          <w:tcPr>
+            <w:tcW w:type="dxa" w:w="3600"/>
+          </w:tcPr>
+          <w:p>
+            <w:r/>
+            <w:r>
+              <w:rPr>
+                <w:sz w:val="20"/>
+              </w:rPr>
+              <w:t>Ms. Bushra Abbas</w:t>
+            </w:r>
+          </w:p>
+        </w:tc>
+        <w:tc>
+          <w:tcPr>
+            <w:tcW w:type="dxa" w:w="2880"/>
+          </w:tcPr>
+          <w:p>
+            <w:r/>
+            <w:r>
+              <w:rPr>
+                <w:sz w:val="20"/>
+              </w:rPr>
+              <w:t>English</w:t>
+            </w:r>
+          </w:p>
+        </w:tc>
+        <w:tc>
+          <w:tcPr>
+            <w:tcW w:type="dxa" w:w="1728"/>
+          </w:tcPr>
+          <w:p>
+            <w:pPr>
+              <w:jc w:val="center"/>
+            </w:pPr>
+            <w:r/>
+            <w:r>
+              <w:rPr>
+                <w:sz w:val="20"/>
+              </w:rPr>
+              <w:t>4</w:t>
+            </w:r>
+          </w:p>
+        </w:tc>
+        <w:tc>
+          <w:tcPr>
+            <w:tcW w:type="dxa" w:w="1152"/>
+          </w:tcPr>
+          <w:p>
+            <w:pPr>
+              <w:jc w:val="center"/>
+            </w:pPr>
+            <w:r/>
+            <w:r>
+              <w:rPr>
+                <w:b/>
+                <w:color w:val="BF8F00"/>
+                <w:sz w:val="20"/>
+              </w:rPr>
+              <w:t>15%</w:t>
+            </w:r>
+          </w:p>
+        </w:tc>
+      </w:tr>
+      <w:tr>
+        <w:tc>
+          <w:tcPr>
+            <w:tcW w:type="dxa" w:w="3600"/>
+          </w:tcPr>
+          <w:p>
+            <w:r/>
+            <w:r>
+              <w:rPr>
+                <w:sz w:val="20"/>
+              </w:rPr>
+              <w:t>None of the above</w:t>
+            </w:r>
+          </w:p>
+        </w:tc>
+        <w:tc>
+          <w:tcPr>
+            <w:tcW w:type="dxa" w:w="2880"/>
+          </w:tcPr>
+          <w:p>
+            <w:r/>
+            <w:r>
+              <w:rPr>
+                <w:sz w:val="20"/>
+              </w:rPr>
+              <w:t>-</w:t>
+            </w:r>
+          </w:p>
+        </w:tc>
+        <w:tc>
+          <w:tcPr>
+            <w:tcW w:type="dxa" w:w="1728"/>
+          </w:tcPr>
+          <w:p>
+            <w:pPr>
+              <w:jc w:val="center"/>
+            </w:pPr>
+            <w:r/>
+            <w:r>
+              <w:rPr>
+                <w:sz w:val="20"/>
+              </w:rPr>
+              <w:t>3</w:t>
+            </w:r>
+          </w:p>
+        </w:tc>
+        <w:tc>
+          <w:tcPr>
+            <w:tcW w:type="dxa" w:w="1152"/>
+          </w:tcPr>
+          <w:p>
+            <w:pPr>
+              <w:jc w:val="center"/>
+            </w:pPr>
+            <w:r/>
+            <w:r>
+              <w:rPr>
+                <w:b/>
+                <w:color w:val="BF8F00"/>
+                <w:sz w:val="20"/>
+              </w:rPr>
+              <w:t>12%</w:t>
+            </w:r>
+          </w:p>
+        </w:tc>
+      </w:tr>
+    </w:tbl>
+    <w:p/>
     <w:sectPr>
       <w:pgSz w:w="12240" w:h="15840"/>
       <w:pgMar w:top="1440" w:right="1800" w:bottom="1440" w:left="1800" w:header="720" w:footer="720" w:gutter="0"/>

</xml_diff>